<commit_message>
docs: RUNBOOK.docx + RUNBOOK_prezentacja.pptx do v12.11 (edycja istniejacych plikow) + kopie v_2026-07-21/22
Topologia G1 offline-first/G2/sup, Launcher 127.0.0.1:8765 (start reczny),
deploy_g1.sh, synchronizacja i 5 flag, narzedzia, ograniczenia,
sekcja Powiadomienia alarmowe - Telegram (wdrazane, nietestowane).

Co-Authored-By: Claude Opus 5.5 <noreply@anthropic.com>
</commit_message>
<xml_diff>
--- a/docs/RUNBOOK.docx
+++ b/docs/RUNBOOK.docx
@@ -35,6 +35,7 @@
     </w:p>
     <w:p>
       <w:r>
+        <w:rPr/>
         <w:t>Dotyczy bieżącego kodu step-by-step (</w:t>
       </w:r>
       <w:r>
@@ -43,9 +44,10 @@
           <w:color w:val="B03060"/>
           <w:sz w:val="19"/>
         </w:rPr>
-        <w:t>test_step5_anomaly.py</w:t>
-      </w:r>
-      <w:r>
+        <w:t>Meshtastic_SCADA.py</w:t>
+      </w:r>
+      <w:r>
+        <w:rPr/>
         <w:t xml:space="preserve"> + </w:t>
       </w:r>
       <w:r>
@@ -57,12 +59,33 @@
         <w:t>skrypty/modules/*</w:t>
       </w:r>
       <w:r>
+        <w:rPr/>
         <w:t>),</w:t>
       </w:r>
     </w:p>
     <w:p>
       <w:r>
-        <w:t xml:space="preserve">NIE legacy monolitów </w:t>
+        <w:rPr/>
+        <w:t>NIE starych monolitów sprzed refaktoru (martwe — nie uruchamiać, nie modyfikować).</w:t>
+      </w:r>
+    </w:p>
+    <w:p>
+      <w:pPr>
+        <w:ind w:left="432"/>
+      </w:pPr>
+      <w:r>
+        <w:rPr/>
+        <w:t xml:space="preserve">Aktualizacja: 2026-10-15 — </w:t>
+      </w:r>
+      <w:r>
+        <w:rPr>
+          <w:b/>
+        </w:rPr>
+        <w:t>wersja końcowa v12.11</w:t>
+      </w:r>
+      <w:r>
+        <w:rPr/>
+        <w:t xml:space="preserve"> (commit </w:t>
       </w:r>
       <w:r>
         <w:rPr>
@@ -70,46 +93,42 @@
           <w:color w:val="B03060"/>
           <w:sz w:val="19"/>
         </w:rPr>
-        <w:t>*_v38.py</w:t>
-      </w:r>
-      <w:r>
-        <w:t>.</w:t>
-      </w:r>
-    </w:p>
-    <w:p>
-      <w:pPr>
-        <w:ind w:left="432"/>
-      </w:pPr>
+        <w:t>b2f8673</w:t>
+      </w:r>
+      <w:r>
+        <w:rPr/>
+        <w:t xml:space="preserve">, branch </w:t>
+      </w:r>
       <w:r>
         <w:rPr>
-          <w:i/>
+          <w:rFonts w:ascii="Consolas" w:hAnsi="Consolas"/>
+          <w:color w:val="B03060"/>
+          <w:sz w:val="19"/>
         </w:rPr>
-        <w:t xml:space="preserve">Aktualizacja: 2026-07-21. Skróty: </w:t>
+        <w:t>step-04-calendar</w:t>
+      </w:r>
+      <w:r>
+        <w:rPr/>
+        <w:t xml:space="preserve">). G1 chodzi na v12.10 — różnica v12.11 dotyczy wyłącznie kodu supervisora. Skróty: </w:t>
       </w:r>
       <w:r>
         <w:rPr>
           <w:b/>
-          <w:i/>
         </w:rPr>
         <w:t>GW</w:t>
       </w:r>
       <w:r>
-        <w:rPr>
-          <w:i/>
-        </w:rPr>
+        <w:rPr/>
         <w:t xml:space="preserve"> = bramka, </w:t>
       </w:r>
       <w:r>
         <w:rPr>
           <w:b/>
-          <w:i/>
         </w:rPr>
         <w:t>SUP</w:t>
       </w:r>
       <w:r>
-        <w:rPr>
-          <w:i/>
-        </w:rPr>
+        <w:rPr/>
         <w:t xml:space="preserve"> = supervisor.</w:t>
       </w:r>
     </w:p>
@@ -252,6 +271,7 @@
         <w:pStyle w:val="ListBullet"/>
       </w:pPr>
       <w:r>
+        <w:rPr/>
         <w:t xml:space="preserve">Ten sam plik </w:t>
       </w:r>
       <w:r>
@@ -260,9 +280,10 @@
           <w:color w:val="B03060"/>
           <w:sz w:val="19"/>
         </w:rPr>
-        <w:t>test_step5_anomaly.py</w:t>
-      </w:r>
-      <w:r>
+        <w:t>Meshtastic_SCADA.py</w:t>
+      </w:r>
+      <w:r>
+        <w:rPr/>
         <w:t xml:space="preserve"> uruchamiany jest w dwóch rolach; rola wynika</w:t>
       </w:r>
     </w:p>
@@ -410,14 +431,17 @@
             <w:tcW w:type="dxa" w:w="2160"/>
           </w:tcPr>
           <w:p>
-            <w:r/>
             <w:r>
               <w:rPr>
                 <w:rFonts w:ascii="Consolas" w:hAnsi="Consolas"/>
                 <w:color w:val="B03060"/>
                 <w:sz w:val="19"/>
               </w:rPr>
-              <w:t>carport-g1</w:t>
+              <w:t>carport</w:t>
+            </w:r>
+            <w:r>
+              <w:rPr/>
+              <w:t xml:space="preserve"> (G1)</w:t>
             </w:r>
           </w:p>
         </w:tc>
@@ -426,14 +450,13 @@
             <w:tcW w:type="dxa" w:w="2160"/>
           </w:tcPr>
           <w:p>
-            <w:r/>
             <w:r>
               <w:rPr>
                 <w:rFonts w:ascii="Consolas" w:hAnsi="Consolas"/>
                 <w:color w:val="B03060"/>
                 <w:sz w:val="19"/>
               </w:rPr>
-              <w:t>100.93.121.31</w:t>
+              <w:t>100.68.79.100</w:t>
             </w:r>
           </w:p>
         </w:tc>
@@ -442,9 +465,9 @@
             <w:tcW w:type="dxa" w:w="2160"/>
           </w:tcPr>
           <w:p>
-            <w:r/>
             <w:r>
-              <w:t>REALNY site — ostrożnie</w:t>
+              <w:rPr/>
+              <w:t>REALNY site (carport) — ostrożnie; v12.10</w:t>
             </w:r>
           </w:p>
         </w:tc>
@@ -498,9 +521,9 @@
             <w:tcW w:type="dxa" w:w="2160"/>
           </w:tcPr>
           <w:p>
-            <w:r/>
             <w:r>
-              <w:t>dom, do testów</w:t>
+              <w:rPr/>
+              <w:t>dom, testy i E2E; v12.11</w:t>
             </w:r>
           </w:p>
         </w:tc>
@@ -554,9 +577,9 @@
             <w:tcW w:type="dxa" w:w="2160"/>
           </w:tcPr>
           <w:p>
-            <w:r/>
             <w:r>
-              <w:t>G0</w:t>
+              <w:rPr/>
+              <w:t>G0; v12.11</w:t>
             </w:r>
           </w:p>
         </w:tc>
@@ -564,6 +587,74 @@
     </w:tbl>
     <w:p/>
     <w:p>
+      <w:pPr/>
+      <w:r>
+        <w:rPr/>
+        <w:t>Stare adresy G1 (</w:t>
+      </w:r>
+      <w:r>
+        <w:rPr>
+          <w:rFonts w:ascii="Consolas" w:hAnsi="Consolas"/>
+          <w:color w:val="B03060"/>
+          <w:sz w:val="19"/>
+        </w:rPr>
+        <w:t>100.104.38.14</w:t>
+      </w:r>
+      <w:r>
+        <w:rPr/>
+        <w:t xml:space="preserve">, </w:t>
+      </w:r>
+      <w:r>
+        <w:rPr>
+          <w:rFonts w:ascii="Consolas" w:hAnsi="Consolas"/>
+          <w:color w:val="B03060"/>
+          <w:sz w:val="19"/>
+        </w:rPr>
+        <w:t>100.93.121.31</w:t>
+      </w:r>
+      <w:r>
+        <w:rPr/>
+        <w:t>) są martwe — nie wracać do nich.</w:t>
+      </w:r>
+    </w:p>
+    <w:p>
+      <w:pPr>
+        <w:ind w:left="432"/>
+      </w:pPr>
+      <w:r>
+        <w:rPr>
+          <w:b/>
+        </w:rPr>
+        <w:t>G1 = offline-first.</w:t>
+      </w:r>
+      <w:r>
+        <w:rPr/>
+        <w:t xml:space="preserve"> Carport nie ma stałego internetu; host pojawia się w Tailscale tylko chwilami. Nie znaczy to, że bramka nie żyje — pracuje i gada po LoRa bez SSH. Stan sprawdzaj po HB na supervisorze, nie po pingu. Gdy w sesji jest okno dostępności, </w:t>
+      </w:r>
+      <w:r>
+        <w:rPr>
+          <w:b/>
+        </w:rPr>
+        <w:t>najpierw deploy na G1</w:t>
+      </w:r>
+      <w:r>
+        <w:rPr/>
+        <w:t xml:space="preserve"> (</w:t>
+      </w:r>
+      <w:r>
+        <w:rPr>
+          <w:rFonts w:ascii="Consolas" w:hAnsi="Consolas"/>
+          <w:color w:val="B03060"/>
+          <w:sz w:val="19"/>
+        </w:rPr>
+        <w:t>bash deploy/deploy_g1.sh 100.68.79.100 gw</w:t>
+      </w:r>
+      <w:r>
+        <w:rPr/>
+        <w:t>, §3.3), potem reszta.</w:t>
+      </w:r>
+    </w:p>
+    <w:p>
       <w:r>
         <w:t xml:space="preserve">Login SSH: użytkownik </w:t>
       </w:r>
@@ -833,26 +924,28 @@
         <w:pStyle w:val="Heading3"/>
       </w:pPr>
       <w:r>
+        <w:rPr/>
         <w:t>3.1 Launcher (zalecane)</w:t>
       </w:r>
     </w:p>
     <w:p>
-      <w:r>
+      <w:pPr/>
+      <w:r>
+        <w:rPr/>
         <w:t xml:space="preserve">Webowy launcher (Flask) na </w:t>
       </w:r>
       <w:r>
         <w:rPr>
+          <w:rFonts w:ascii="Consolas" w:hAnsi="Consolas"/>
           <w:b/>
+          <w:color w:val="B03060"/>
+          <w:sz w:val="19"/>
         </w:rPr>
-        <w:t>`http://localhost:8765`</w:t>
-      </w:r>
-      <w:r>
-        <w:t xml:space="preserve"> steruje startem/stopem na</w:t>
-      </w:r>
-    </w:p>
-    <w:p>
-      <w:r>
-        <w:t xml:space="preserve">zdalnych maszynach (SSH → </w:t>
+        <w:t>http://127.0.0.1:8765</w:t>
+      </w:r>
+      <w:r>
+        <w:rPr/>
+        <w:t xml:space="preserve"> steruje startem/stopem na zdalnych maszynach (SSH → </w:t>
       </w:r>
       <w:r>
         <w:rPr>
@@ -863,15 +956,34 @@
         <w:t>tmux</w:t>
       </w:r>
       <w:r>
-        <w:t>). Robi robust-kill + weryfikację (nie kłamie, że</w:t>
+        <w:rPr/>
+        <w:t xml:space="preserve">). </w:t>
+      </w:r>
+      <w:r>
+        <w:rPr>
+          <w:b/>
+        </w:rPr>
+        <w:t>Nie wstaje sam po restarcie PC</w:t>
+      </w:r>
+      <w:r>
+        <w:rPr/>
+        <w:t xml:space="preserve"> — uruchom go ręcznie z katalogu repo: </w:t>
+      </w:r>
+      <w:r>
+        <w:rPr>
+          <w:rFonts w:ascii="Consolas" w:hAnsi="Consolas"/>
+          <w:color w:val="B03060"/>
+          <w:sz w:val="19"/>
+        </w:rPr>
+        <w:t>python launcher/app.py</w:t>
+      </w:r>
+      <w:r>
+        <w:rPr/>
+        <w:t>. Robi robust-kill + weryfikację (nie kłamie, że „stopped", jeśli proces żyje).</w:t>
       </w:r>
     </w:p>
     <w:p>
-      <w:r>
-        <w:t>„stopped", jeśli proces żyje).</w:t>
-      </w:r>
-    </w:p>
-    <w:p>
+      <w:pPr/>
       <w:r>
         <w:rPr>
           <w:b/>
@@ -884,6 +996,7 @@
         <w:pStyle w:val="ListNumber"/>
       </w:pPr>
       <w:r>
+        <w:rPr/>
         <w:t xml:space="preserve">Wybierz </w:t>
       </w:r>
       <w:r>
@@ -893,6 +1006,7 @@
         <w:t>host</w:t>
       </w:r>
       <w:r>
+        <w:rPr/>
         <w:t xml:space="preserve"> (</w:t>
       </w:r>
       <w:r>
@@ -904,6 +1018,7 @@
         <w:t>carport-g2</w:t>
       </w:r>
       <w:r>
+        <w:rPr/>
         <w:t xml:space="preserve"> / </w:t>
       </w:r>
       <w:r>
@@ -915,6 +1030,7 @@
         <w:t>supervisor</w:t>
       </w:r>
       <w:r>
+        <w:rPr/>
         <w:t xml:space="preserve"> / …).</w:t>
       </w:r>
     </w:p>
@@ -923,6 +1039,7 @@
         <w:pStyle w:val="ListNumber"/>
       </w:pPr>
       <w:r>
+        <w:rPr/>
         <w:t xml:space="preserve">Wybierz </w:t>
       </w:r>
       <w:r>
@@ -932,6 +1049,7 @@
         <w:t>skrypt</w:t>
       </w:r>
       <w:r>
+        <w:rPr/>
         <w:t xml:space="preserve">: </w:t>
       </w:r>
       <w:r>
@@ -940,9 +1058,10 @@
           <w:color w:val="B03060"/>
           <w:sz w:val="19"/>
         </w:rPr>
-        <w:t>test_step5_anomaly.py</w:t>
-      </w:r>
-      <w:r>
+        <w:t>Meshtastic_SCADA.py</w:t>
+      </w:r>
+      <w:r>
+        <w:rPr/>
         <w:t>.</w:t>
       </w:r>
     </w:p>
@@ -957,6 +1076,7 @@
         <w:t>Start</w:t>
       </w:r>
       <w:r>
+        <w:rPr/>
         <w:t xml:space="preserve"> (rola </w:t>
       </w:r>
       <w:r>
@@ -968,6 +1088,7 @@
         <w:t>gw</w:t>
       </w:r>
       <w:r>
+        <w:rPr/>
         <w:t xml:space="preserve"> dla bramki, </w:t>
       </w:r>
       <w:r>
@@ -979,6 +1100,7 @@
         <w:t>sup</w:t>
       </w:r>
       <w:r>
+        <w:rPr/>
         <w:t xml:space="preserve"> dla supervisora).</w:t>
       </w:r>
     </w:p>
@@ -987,6 +1109,7 @@
         <w:pStyle w:val="ListNumber"/>
       </w:pPr>
       <w:r>
+        <w:rPr/>
         <w:t xml:space="preserve">Podgląd logu: przycisk </w:t>
       </w:r>
       <w:r>
@@ -996,6 +1119,7 @@
         <w:t>tail</w:t>
       </w:r>
       <w:r>
+        <w:rPr/>
         <w:t xml:space="preserve"> (otwiera nową kartę </w:t>
       </w:r>
       <w:r>
@@ -1007,10 +1131,12 @@
         <w:t>tail -F</w:t>
       </w:r>
       <w:r>
+        <w:rPr/>
         <w:t xml:space="preserve"> remote logu).</w:t>
       </w:r>
     </w:p>
     <w:p>
+      <w:pPr/>
       <w:r>
         <w:rPr>
           <w:b/>
@@ -1020,7 +1146,6 @@
     </w:p>
     <w:p>
       <w:pPr>
-        <w:spacing w:after="0" w:before="0"/>
         <w:ind w:left="216"/>
       </w:pPr>
       <w:r>
@@ -1033,7 +1158,6 @@
     </w:p>
     <w:p>
       <w:pPr>
-        <w:spacing w:after="0" w:before="0"/>
         <w:ind w:left="216"/>
       </w:pPr>
       <w:r>
@@ -1046,7 +1170,6 @@
     </w:p>
     <w:p>
       <w:pPr>
-        <w:spacing w:after="0" w:before="0"/>
         <w:ind w:left="216"/>
       </w:pPr>
       <w:r>
@@ -1059,7 +1182,6 @@
     </w:p>
     <w:p>
       <w:pPr>
-        <w:spacing w:after="0" w:before="0"/>
         <w:ind w:left="216"/>
       </w:pPr>
       <w:r>
@@ -1067,12 +1189,11 @@
           <w:rFonts w:ascii="Consolas" w:hAnsi="Consolas"/>
           <w:sz w:val="18"/>
         </w:rPr>
-        <w:t xml:space="preserve">  -d '{"host":"carport-g2","role":"gw","script":"test_step5_anomaly.py"}'</w:t>
+        <w:t xml:space="preserve">  -d '{"host":"carport-g2","role":"gw","script":"Meshtastic_SCADA.py"}'</w:t>
       </w:r>
     </w:p>
     <w:p>
       <w:pPr>
-        <w:spacing w:after="0" w:before="0"/>
         <w:ind w:left="216"/>
       </w:pPr>
       <w:r>
@@ -1085,7 +1206,6 @@
     </w:p>
     <w:p>
       <w:pPr>
-        <w:spacing w:after="0" w:before="0"/>
         <w:ind w:left="216"/>
       </w:pPr>
       <w:r>
@@ -1098,7 +1218,6 @@
     </w:p>
     <w:p>
       <w:pPr>
-        <w:spacing w:after="0" w:before="0"/>
         <w:ind w:left="216"/>
       </w:pPr>
       <w:r>
@@ -1111,7 +1230,6 @@
     </w:p>
     <w:p>
       <w:pPr>
-        <w:spacing w:after="0" w:before="0"/>
         <w:ind w:left="216"/>
       </w:pPr>
       <w:r>
@@ -1124,7 +1242,6 @@
     </w:p>
     <w:p>
       <w:pPr>
-        <w:spacing w:after="0" w:before="0"/>
         <w:ind w:left="216"/>
       </w:pPr>
       <w:r>
@@ -1132,12 +1249,11 @@
           <w:rFonts w:ascii="Consolas" w:hAnsi="Consolas"/>
           <w:sz w:val="18"/>
         </w:rPr>
-        <w:t xml:space="preserve">  -d '{"host":"supervisor","role":"sup","script":"test_step5_anomaly.py"}'</w:t>
+        <w:t xml:space="preserve">  -d '{"host":"supervisor","role":"sup","script":"Meshtastic_SCADA.py"}'</w:t>
       </w:r>
     </w:p>
     <w:p>
       <w:pPr>
-        <w:spacing w:after="0" w:before="0"/>
         <w:ind w:left="216"/>
       </w:pPr>
       <w:r>
@@ -1150,7 +1266,6 @@
     </w:p>
     <w:p>
       <w:pPr>
-        <w:spacing w:after="0" w:before="0"/>
         <w:ind w:left="216"/>
       </w:pPr>
       <w:r>
@@ -1163,7 +1278,6 @@
     </w:p>
     <w:p>
       <w:pPr>
-        <w:spacing w:after="0" w:before="0"/>
         <w:ind w:left="216"/>
       </w:pPr>
       <w:r>
@@ -1176,7 +1290,6 @@
     </w:p>
     <w:p>
       <w:pPr>
-        <w:spacing w:after="0" w:before="0"/>
         <w:ind w:left="216"/>
       </w:pPr>
       <w:r>
@@ -1189,7 +1302,6 @@
     </w:p>
     <w:p>
       <w:pPr>
-        <w:spacing w:after="0" w:before="0"/>
         <w:ind w:left="216"/>
       </w:pPr>
       <w:r>
@@ -1202,7 +1314,6 @@
     </w:p>
     <w:p>
       <w:pPr>
-        <w:spacing w:after="0" w:before="0"/>
         <w:ind w:left="216"/>
       </w:pPr>
       <w:r>
@@ -1215,7 +1326,6 @@
     </w:p>
     <w:p>
       <w:pPr>
-        <w:spacing w:after="0" w:before="0"/>
         <w:ind w:left="216"/>
       </w:pPr>
       <w:r>
@@ -1228,7 +1338,6 @@
     </w:p>
     <w:p>
       <w:pPr>
-        <w:spacing w:after="0" w:before="0"/>
         <w:ind w:left="216"/>
       </w:pPr>
       <w:r>
@@ -1241,7 +1350,6 @@
     </w:p>
     <w:p>
       <w:pPr>
-        <w:spacing w:after="0" w:before="0"/>
         <w:ind w:left="216"/>
       </w:pPr>
       <w:r>
@@ -1252,9 +1360,10 @@
         <w:t xml:space="preserve">  -d '{"host":"carport-g2","role":"gw"}'</w:t>
       </w:r>
     </w:p>
-    <w:p/>
     <w:p>
-      <w:r>
+      <w:pPr/>
+      <w:r>
+        <w:rPr/>
         <w:t xml:space="preserve">Inne endpointy: </w:t>
       </w:r>
       <w:r>
@@ -1266,6 +1375,7 @@
         <w:t>/api/status</w:t>
       </w:r>
       <w:r>
+        <w:rPr/>
         <w:t xml:space="preserve">, </w:t>
       </w:r>
       <w:r>
@@ -1277,6 +1387,7 @@
         <w:t>/api/scripts?host=</w:t>
       </w:r>
       <w:r>
+        <w:rPr/>
         <w:t xml:space="preserve">, </w:t>
       </w:r>
       <w:r>
@@ -1288,10 +1399,9 @@
         <w:t>/api/usb-devices?host=</w:t>
       </w:r>
       <w:r>
-        <w:t>,</w:t>
-      </w:r>
-    </w:p>
-    <w:p>
+        <w:rPr/>
+        <w:t xml:space="preserve">, </w:t>
+      </w:r>
       <w:r>
         <w:rPr>
           <w:rFonts w:ascii="Consolas" w:hAnsi="Consolas"/>
@@ -1301,6 +1411,7 @@
         <w:t>/api/config?host=</w:t>
       </w:r>
       <w:r>
+        <w:rPr/>
         <w:t xml:space="preserve"> + </w:t>
       </w:r>
       <w:r>
@@ -1312,6 +1423,7 @@
         <w:t>/api/config-save</w:t>
       </w:r>
       <w:r>
+        <w:rPr/>
         <w:t xml:space="preserve"> (podgląd/edycja </w:t>
       </w:r>
       <w:r>
@@ -1323,6 +1435,7 @@
         <w:t>config.py</w:t>
       </w:r>
       <w:r>
+        <w:rPr/>
         <w:t xml:space="preserve">), </w:t>
       </w:r>
       <w:r>
@@ -1334,6 +1447,7 @@
         <w:t>/api/pull-log</w:t>
       </w:r>
       <w:r>
+        <w:rPr/>
         <w:t>.</w:t>
       </w:r>
     </w:p>
@@ -1344,41 +1458,11 @@
       <w:r>
         <w:rPr>
           <w:b/>
-          <w:i/>
         </w:rPr>
-        <w:t>Zasada:</w:t>
-      </w:r>
-      <w:r>
-        <w:rPr>
-          <w:i/>
-        </w:rPr>
-        <w:t xml:space="preserve"> skrypty testowe URUCHAMIA SIĘ Z LAUNCHERA. Nie odpalać/ubijać ręcznie</w:t>
-      </w:r>
-    </w:p>
-    <w:p>
-      <w:pPr>
-        <w:ind w:left="432"/>
-      </w:pPr>
-      <w:r>
-        <w:rPr>
-          <w:i/>
-        </w:rPr>
-        <w:t xml:space="preserve">legacy </w:t>
-      </w:r>
-      <w:r>
-        <w:rPr>
-          <w:rFonts w:ascii="Consolas" w:hAnsi="Consolas"/>
-          <w:i/>
-          <w:color w:val="B03060"/>
-          <w:sz w:val="19"/>
-        </w:rPr>
-        <w:t>*_v38.py</w:t>
-      </w:r>
-      <w:r>
-        <w:rPr>
-          <w:i/>
-        </w:rPr>
-        <w:t>.</w:t>
+        <w:t xml:space="preserve">Zasada: skrypty URUCHAMIA SIĘ Z LAUNCHERA. </w:t>
+      </w:r>
+      <w:r>
+        <w:t>Stare monolity (sprzed refaktoru) są martwe — nie odpalać, nie modyfikować.</w:t>
       </w:r>
     </w:p>
     <w:p>
@@ -1386,17 +1470,19 @@
         <w:pStyle w:val="Heading3"/>
       </w:pPr>
       <w:r>
+        <w:rPr/>
         <w:t>3.2 Fallback — ręcznie przez SSH + tmux</w:t>
       </w:r>
     </w:p>
     <w:p>
-      <w:r>
+      <w:pPr/>
+      <w:r>
+        <w:rPr/>
         <w:t>Gdy launcher niedostępny (odzwierciedla dokładnie to, co robi launcher):</w:t>
       </w:r>
     </w:p>
     <w:p>
       <w:pPr>
-        <w:spacing w:after="0" w:before="0"/>
         <w:ind w:left="216"/>
       </w:pPr>
       <w:r>
@@ -1409,7 +1495,6 @@
     </w:p>
     <w:p>
       <w:pPr>
-        <w:spacing w:after="0" w:before="0"/>
         <w:ind w:left="216"/>
       </w:pPr>
       <w:r>
@@ -1422,7 +1507,6 @@
     </w:p>
     <w:p>
       <w:pPr>
-        <w:spacing w:after="0" w:before="0"/>
         <w:ind w:left="216"/>
       </w:pPr>
       <w:r>
@@ -1435,7 +1519,6 @@
     </w:p>
     <w:p>
       <w:pPr>
-        <w:spacing w:after="0" w:before="0"/>
         <w:ind w:left="216"/>
       </w:pPr>
       <w:r>
@@ -1443,12 +1526,11 @@
           <w:rFonts w:ascii="Consolas" w:hAnsi="Consolas"/>
           <w:sz w:val="18"/>
         </w:rPr>
-        <w:t>tmux new -d -s gw 'venv/bin/python -u test_step5_anomaly.py 2&gt;&gt;/tmp/test_transport.stderr.log'</w:t>
+        <w:t>tmux new -d -s gw 'venv/bin/python -u Meshtastic_SCADA.py 2&gt;&gt;/tmp/test_transport.stderr.log'</w:t>
       </w:r>
     </w:p>
     <w:p>
       <w:pPr>
-        <w:spacing w:after="0" w:before="0"/>
         <w:ind w:left="216"/>
       </w:pPr>
       <w:r>
@@ -1461,7 +1543,6 @@
     </w:p>
     <w:p>
       <w:pPr>
-        <w:spacing w:after="0" w:before="0"/>
         <w:ind w:left="216"/>
       </w:pPr>
       <w:r>
@@ -1474,7 +1555,6 @@
     </w:p>
     <w:p>
       <w:pPr>
-        <w:spacing w:after="0" w:before="0"/>
         <w:ind w:left="216"/>
       </w:pPr>
       <w:r>
@@ -1487,7 +1567,6 @@
     </w:p>
     <w:p>
       <w:pPr>
-        <w:spacing w:after="0" w:before="0"/>
         <w:ind w:left="216"/>
       </w:pPr>
       <w:r>
@@ -1500,7 +1579,6 @@
     </w:p>
     <w:p>
       <w:pPr>
-        <w:spacing w:after="0" w:before="0"/>
         <w:ind w:left="216"/>
       </w:pPr>
       <w:r>
@@ -1508,34 +1586,41 @@
           <w:rFonts w:ascii="Consolas" w:hAnsi="Consolas"/>
           <w:sz w:val="18"/>
         </w:rPr>
-        <w:t>tmux kill-session -t gw ; pkill -f 'python -u test_step5_anomaly.py'</w:t>
-      </w:r>
-    </w:p>
-    <w:p/>
-    <w:p>
-      <w:r>
-        <w:t xml:space="preserve">Sesje tmux: </w:t>
-      </w:r>
-      <w:r>
-        <w:rPr>
-          <w:b/>
-        </w:rPr>
-        <w:t>`gw`</w:t>
-      </w:r>
-      <w:r>
-        <w:t xml:space="preserve"> (bramka) / </w:t>
-      </w:r>
-      <w:r>
-        <w:rPr>
-          <w:b/>
-        </w:rPr>
-        <w:t>`sup`</w:t>
-      </w:r>
-      <w:r>
-        <w:t xml:space="preserve"> (supervisor). Log runtime dla skryptów</w:t>
+        <w:t>tmux kill-session -t gw ; pkill -f 'python -u Meshtastic_SCADA.py'</w:t>
       </w:r>
     </w:p>
     <w:p>
+      <w:pPr/>
+      <w:r>
+        <w:rPr/>
+        <w:t xml:space="preserve">Sesje tmux: </w:t>
+      </w:r>
+      <w:r>
+        <w:rPr>
+          <w:rFonts w:ascii="Consolas" w:hAnsi="Consolas"/>
+          <w:b/>
+          <w:color w:val="B03060"/>
+          <w:sz w:val="19"/>
+        </w:rPr>
+        <w:t>gw</w:t>
+      </w:r>
+      <w:r>
+        <w:rPr/>
+        <w:t xml:space="preserve"> (bramka) / </w:t>
+      </w:r>
+      <w:r>
+        <w:rPr>
+          <w:rFonts w:ascii="Consolas" w:hAnsi="Consolas"/>
+          <w:b/>
+          <w:color w:val="B03060"/>
+          <w:sz w:val="19"/>
+        </w:rPr>
+        <w:t>sup</w:t>
+      </w:r>
+      <w:r>
+        <w:rPr/>
+        <w:t xml:space="preserve"> (supervisor). Log runtime dla skryptów </w:t>
+      </w:r>
       <w:r>
         <w:rPr>
           <w:rFonts w:ascii="Consolas" w:hAnsi="Consolas"/>
@@ -1545,6 +1630,7 @@
         <w:t>test_*</w:t>
       </w:r>
       <w:r>
+        <w:rPr/>
         <w:t xml:space="preserve">: </w:t>
       </w:r>
       <w:r>
@@ -1556,6 +1642,7 @@
         <w:t>/tmp/test_transport.log</w:t>
       </w:r>
       <w:r>
+        <w:rPr/>
         <w:t xml:space="preserve"> (+ </w:t>
       </w:r>
       <w:r>
@@ -1567,6 +1654,7 @@
         <w:t>.stderr.log</w:t>
       </w:r>
       <w:r>
+        <w:rPr/>
         <w:t>).</w:t>
       </w:r>
     </w:p>
@@ -1575,11 +1663,14 @@
         <w:pStyle w:val="Heading3"/>
       </w:pPr>
       <w:r>
+        <w:rPr/>
         <w:t>3.3 Wdrożenie / aktualizacja kodu</w:t>
       </w:r>
     </w:p>
     <w:p>
-      <w:r>
+      <w:pPr/>
+      <w:r>
+        <w:rPr/>
         <w:t xml:space="preserve">Kod żyje w </w:t>
       </w:r>
       <w:r>
@@ -1591,12 +1682,12 @@
         <w:t>~/meshtastic/</w:t>
       </w:r>
       <w:r>
+        <w:rPr/>
         <w:t xml:space="preserve"> na maszynie. Aktualizacja (przykład, z maszyny dev):</w:t>
       </w:r>
     </w:p>
     <w:p>
       <w:pPr>
-        <w:spacing w:after="0" w:before="0"/>
         <w:ind w:left="216"/>
       </w:pPr>
       <w:r>
@@ -1609,7 +1700,6 @@
     </w:p>
     <w:p>
       <w:pPr>
-        <w:spacing w:after="0" w:before="0"/>
         <w:ind w:left="216"/>
       </w:pPr>
       <w:r>
@@ -1622,7 +1712,6 @@
     </w:p>
     <w:p>
       <w:pPr>
-        <w:spacing w:after="0" w:before="0"/>
         <w:ind w:left="216"/>
       </w:pPr>
       <w:r>
@@ -1633,7 +1722,6 @@
         <w:t># po deployu: restart roli z launchera (wczytuje nowy kod)</w:t>
       </w:r>
     </w:p>
-    <w:p/>
     <w:p>
       <w:pPr>
         <w:ind w:left="432"/>
@@ -1641,82 +1729,183 @@
       <w:r>
         <w:rPr>
           <w:b/>
-          <w:i/>
         </w:rPr>
-        <w:t>NIE deployować `config.py`</w:t>
-      </w:r>
-      <w:r>
-        <w:rPr>
-          <w:i/>
-        </w:rPr>
-        <w:t xml:space="preserve"> przez scp z repo — remote ma prawdziwe, per-maszynowe</w:t>
-      </w:r>
-    </w:p>
-    <w:p>
-      <w:pPr>
-        <w:ind w:left="432"/>
-      </w:pPr>
-      <w:r>
-        <w:rPr>
-          <w:i/>
-        </w:rPr>
-        <w:t xml:space="preserve">wartości (tokeny, listy </w:t>
+        <w:t xml:space="preserve">NIE deployować </w:t>
       </w:r>
       <w:r>
         <w:rPr>
           <w:rFonts w:ascii="Consolas" w:hAnsi="Consolas"/>
-          <w:i/>
+          <w:b/>
+          <w:color w:val="B03060"/>
+          <w:sz w:val="19"/>
+        </w:rPr>
+        <w:t>config.py</w:t>
+      </w:r>
+      <w:r>
+        <w:rPr/>
+        <w:t xml:space="preserve"> przez scp z repo — remote ma prawdziwe, per-maszynowe wartości (tokeny, listy </w:t>
+      </w:r>
+      <w:r>
+        <w:rPr>
+          <w:rFonts w:ascii="Consolas" w:hAnsi="Consolas"/>
           <w:color w:val="B03060"/>
           <w:sz w:val="19"/>
         </w:rPr>
         <w:t>monitored</w:t>
       </w:r>
       <w:r>
-        <w:rPr>
-          <w:i/>
-        </w:rPr>
+        <w:rPr/>
         <w:t>/</w:t>
       </w:r>
       <w:r>
         <w:rPr>
           <w:rFonts w:ascii="Consolas" w:hAnsi="Consolas"/>
-          <w:i/>
           <w:color w:val="B03060"/>
           <w:sz w:val="19"/>
         </w:rPr>
         <w:t>priority</w:t>
       </w:r>
       <w:r>
-        <w:rPr>
-          <w:i/>
-        </w:rPr>
-        <w:t>, porty). Edytować remote in-place</w:t>
-      </w:r>
-    </w:p>
-    <w:p>
-      <w:pPr>
-        <w:ind w:left="432"/>
-      </w:pPr>
-      <w:r>
-        <w:rPr>
-          <w:i/>
-        </w:rPr>
-        <w:t xml:space="preserve">(sed/ssh) albo przez </w:t>
+        <w:rPr/>
+        <w:t xml:space="preserve">, porty, </w:t>
       </w:r>
       <w:r>
         <w:rPr>
           <w:rFonts w:ascii="Consolas" w:hAnsi="Consolas"/>
-          <w:i/>
+          <w:color w:val="B03060"/>
+          <w:sz w:val="19"/>
+        </w:rPr>
+        <w:t>params_preset</w:t>
+      </w:r>
+      <w:r>
+        <w:rPr/>
+        <w:t xml:space="preserve">). Edytować remote in-place (sed/ssh) albo przez </w:t>
+      </w:r>
+      <w:r>
+        <w:rPr>
+          <w:rFonts w:ascii="Consolas" w:hAnsi="Consolas"/>
           <w:color w:val="B03060"/>
           <w:sz w:val="19"/>
         </w:rPr>
         <w:t>/api/config-save</w:t>
       </w:r>
       <w:r>
+        <w:rPr/>
+        <w:t>.</w:t>
+      </w:r>
+    </w:p>
+    <w:p>
+      <w:pPr/>
+      <w:r>
         <w:rPr>
-          <w:i/>
+          <w:b/>
         </w:rPr>
-        <w:t>.</w:t>
+        <w:t>Deploy całości jednym strzałem</w:t>
+      </w:r>
+      <w:r>
+        <w:rPr/>
+        <w:t xml:space="preserve"> — standardowa droga wgrywania: </w:t>
+      </w:r>
+      <w:r>
+        <w:rPr>
+          <w:rFonts w:ascii="Consolas" w:hAnsi="Consolas"/>
+          <w:color w:val="B03060"/>
+          <w:sz w:val="19"/>
+        </w:rPr>
+        <w:t>bash deploy/deploy_g1.sh &lt;IP&gt; &lt;gw|sup&gt;</w:t>
+      </w:r>
+      <w:r>
+        <w:rPr/>
+        <w:t xml:space="preserve"> (drugi argument = rola / sesja tmux).</w:t>
+      </w:r>
+    </w:p>
+    <w:p>
+      <w:pPr>
+        <w:ind w:left="216"/>
+      </w:pPr>
+      <w:r>
+        <w:rPr>
+          <w:rFonts w:ascii="Consolas" w:hAnsi="Consolas"/>
+          <w:sz w:val="18"/>
+        </w:rPr>
+        <w:t>bash deploy/deploy_g1.sh 100.68.79.100 gw    # G1 carport (domyślny host)</w:t>
+      </w:r>
+    </w:p>
+    <w:p>
+      <w:pPr>
+        <w:ind w:left="216"/>
+      </w:pPr>
+      <w:r>
+        <w:rPr>
+          <w:rFonts w:ascii="Consolas" w:hAnsi="Consolas"/>
+          <w:sz w:val="18"/>
+        </w:rPr>
+        <w:t>bash deploy/deploy_g1.sh 100.98.155.78 gw    # G2 testbed</w:t>
+      </w:r>
+    </w:p>
+    <w:p>
+      <w:pPr>
+        <w:ind w:left="216"/>
+      </w:pPr>
+      <w:r>
+        <w:rPr>
+          <w:rFonts w:ascii="Consolas" w:hAnsi="Consolas"/>
+          <w:sz w:val="18"/>
+        </w:rPr>
+        <w:t>bash deploy/deploy_g1.sh 100.79.111.24 sup   # supervisor</w:t>
+      </w:r>
+    </w:p>
+    <w:p>
+      <w:pPr/>
+      <w:r>
+        <w:rPr/>
+        <w:t>Kolejność jest celowa: backup na maszynie (</w:t>
+      </w:r>
+      <w:r>
+        <w:rPr>
+          <w:rFonts w:ascii="Consolas" w:hAnsi="Consolas"/>
+          <w:color w:val="B03060"/>
+          <w:sz w:val="19"/>
+        </w:rPr>
+        <w:t>~/meshtastic_backup_&lt;data&gt;.tgz</w:t>
+      </w:r>
+      <w:r>
+        <w:rPr/>
+        <w:t xml:space="preserve">) → kopia plików → </w:t>
+      </w:r>
+      <w:r>
+        <w:rPr>
+          <w:b/>
+        </w:rPr>
+        <w:t>walidacja AST NA MASZYNIE</w:t>
+      </w:r>
+      <w:r>
+        <w:rPr/>
+        <w:t xml:space="preserve"> → smoke testy → dopiero restart. Skrypt świadomie nie dotyka </w:t>
+      </w:r>
+      <w:r>
+        <w:rPr>
+          <w:rFonts w:ascii="Consolas" w:hAnsi="Consolas"/>
+          <w:color w:val="B03060"/>
+          <w:sz w:val="19"/>
+        </w:rPr>
+        <w:t>config.py</w:t>
+      </w:r>
+      <w:r>
+        <w:rPr/>
+        <w:t xml:space="preserve"> ani stanów w </w:t>
+      </w:r>
+      <w:r>
+        <w:rPr>
+          <w:rFonts w:ascii="Consolas" w:hAnsi="Consolas"/>
+          <w:color w:val="B03060"/>
+          <w:sz w:val="19"/>
+        </w:rPr>
+        <w:t>/tmp</w:t>
+      </w:r>
+      <w:r>
+        <w:rPr/>
+        <w:t>. Po deployu sprawdź na supervisorze HB od bramki i pięć flag zgodności (§5.5).</w:t>
       </w:r>
     </w:p>
     <w:p>
@@ -1724,56 +1913,15 @@
         <w:pStyle w:val="Heading2"/>
       </w:pPr>
       <w:r>
-        <w:t>4. Wdrożenie dashboardu</w:t>
+        <w:rPr/>
+        <w:t>4. Dashboard</w:t>
       </w:r>
     </w:p>
     <w:p>
-      <w:r>
-        <w:t xml:space="preserve">Dashboard Lovelace generowany skryptem — uruchom </w:t>
-      </w:r>
-      <w:r>
-        <w:rPr>
-          <w:b/>
-        </w:rPr>
-        <w:t>na danej maszynie</w:t>
-      </w:r>
-      <w:r>
-        <w:t xml:space="preserve"> (osobno GW i SUP,</w:t>
-      </w:r>
-    </w:p>
-    <w:p>
-      <w:r>
-        <w:t xml:space="preserve">każdy generuje swój wariant wg </w:t>
-      </w:r>
-      <w:r>
-        <w:rPr>
-          <w:rFonts w:ascii="Consolas" w:hAnsi="Consolas"/>
-          <w:color w:val="B03060"/>
-          <w:sz w:val="19"/>
-        </w:rPr>
-        <w:t>ROLE</w:t>
-      </w:r>
-      <w:r>
-        <w:t>):</w:t>
-      </w:r>
-    </w:p>
-    <w:p>
-      <w:pPr>
-        <w:spacing w:after="0" w:before="0"/>
-        <w:ind w:left="216"/>
-      </w:pPr>
-      <w:r>
-        <w:rPr>
-          <w:rFonts w:ascii="Consolas" w:hAnsi="Consolas"/>
-          <w:sz w:val="18"/>
-        </w:rPr>
-        <w:t>ssh td@100.98.155.78 'cd ~/meshtastic &amp;&amp; venv/bin/python homeassistant/gen_unified_dashboard.py'</w:t>
-      </w:r>
-    </w:p>
-    <w:p/>
-    <w:p>
-      <w:r>
-        <w:t xml:space="preserve">Tworzy dashboard </w:t>
+      <w:pPr/>
+      <w:r>
+        <w:rPr/>
+        <w:t xml:space="preserve">Dashboard </w:t>
       </w:r>
       <w:r>
         <w:rPr>
@@ -1784,12 +1932,83 @@
         <w:t>url_path = lora-scada</w:t>
       </w:r>
       <w:r>
-        <w:t xml:space="preserve"> (tytuł „LoRa SCADA"), tryb storage.</w:t>
+        <w:rPr/>
+        <w:t xml:space="preserve"> (tytuł „LoRa SCADA"), tryb storage, na każdej maszynie. Encje pochodzą z MQTT Discovery (retained w brokerze) — dashboard tylko je układa.</w:t>
       </w:r>
     </w:p>
     <w:p>
-      <w:r>
-        <w:t>Encje pochodzą z MQTT Discovery (retained w brokerze) — dashboard tylko je układa.</w:t>
+      <w:pPr>
+        <w:ind w:left="432"/>
+      </w:pPr>
+      <w:r>
+        <w:rPr>
+          <w:b/>
+        </w:rPr>
+        <w:t>ZAKAZ uruchamiania starych generatorów</w:t>
+      </w:r>
+      <w:r>
+        <w:rPr/>
+        <w:t xml:space="preserve"> (</w:t>
+      </w:r>
+      <w:r>
+        <w:rPr>
+          <w:rFonts w:ascii="Consolas" w:hAnsi="Consolas"/>
+          <w:color w:val="B03060"/>
+          <w:sz w:val="19"/>
+        </w:rPr>
+        <w:t>gen_unified_dashboard.py</w:t>
+      </w:r>
+      <w:r>
+        <w:rPr/>
+        <w:t xml:space="preserve">, </w:t>
+      </w:r>
+      <w:r>
+        <w:rPr>
+          <w:rFonts w:ascii="Consolas" w:hAnsi="Consolas"/>
+          <w:color w:val="B03060"/>
+          <w:sz w:val="19"/>
+        </w:rPr>
+        <w:t>gen_*_dashboard.py</w:t>
+      </w:r>
+      <w:r>
+        <w:rPr/>
+        <w:t xml:space="preserve">) — nadpisują ręcznie ułożone ekrany. Zmiany wprowadza się chirurgicznie przez HA WebSocket API, z backupem konfiguracji Lovelace przed zapisem (wzór: </w:t>
+      </w:r>
+      <w:r>
+        <w:rPr>
+          <w:rFonts w:ascii="Consolas" w:hAnsi="Consolas"/>
+          <w:color w:val="B03060"/>
+          <w:sz w:val="19"/>
+        </w:rPr>
+        <w:t>tools/fix_popups_live.py</w:t>
+      </w:r>
+      <w:r>
+        <w:rPr/>
+        <w:t xml:space="preserve">). Odtworzenie od zera: backup HA albo zrzuty z paczki </w:t>
+      </w:r>
+      <w:r>
+        <w:rPr>
+          <w:rFonts w:ascii="Consolas" w:hAnsi="Consolas"/>
+          <w:color w:val="B03060"/>
+          <w:sz w:val="19"/>
+        </w:rPr>
+        <w:t>3_DASHBOARDY_HOME_ASSISTANT</w:t>
+      </w:r>
+      <w:r>
+        <w:rPr/>
+        <w:t xml:space="preserve">. Kontrola, czy każda encja z dashboardu istnieje: </w:t>
+      </w:r>
+      <w:r>
+        <w:rPr>
+          <w:rFonts w:ascii="Consolas" w:hAnsi="Consolas"/>
+          <w:color w:val="B03060"/>
+          <w:sz w:val="19"/>
+        </w:rPr>
+        <w:t>tools/dash_audit.py</w:t>
+      </w:r>
+      <w:r>
+        <w:rPr/>
+        <w:t xml:space="preserve"> (§11).</w:t>
       </w:r>
     </w:p>
     <w:p>
@@ -2179,6 +2398,7 @@
         <w:pStyle w:val="ListBullet"/>
       </w:pPr>
       <w:r>
+        <w:rPr/>
         <w:t xml:space="preserve">Kafle: </w:t>
       </w:r>
       <w:r>
@@ -2190,6 +2410,7 @@
         <w:t>sensor.lora_&lt;gw&gt;_&lt;dev&gt;_temperature</w:t>
       </w:r>
       <w:r>
+        <w:rPr/>
         <w:t xml:space="preserve"> / </w:t>
       </w:r>
       <w:r>
@@ -2201,6 +2422,7 @@
         <w:t>_humidity</w:t>
       </w:r>
       <w:r>
+        <w:rPr/>
         <w:t xml:space="preserve"> / </w:t>
       </w:r>
       <w:r>
@@ -2212,10 +2434,9 @@
         <w:t>_battery</w:t>
       </w:r>
       <w:r>
-        <w:t>,</w:t>
-      </w:r>
-    </w:p>
-    <w:p>
+        <w:rPr/>
+        <w:t xml:space="preserve">, </w:t>
+      </w:r>
       <w:r>
         <w:rPr>
           <w:rFonts w:ascii="Consolas" w:hAnsi="Consolas"/>
@@ -2225,6 +2446,7 @@
         <w:t>binary_sensor.lora_&lt;gw&gt;_&lt;dev&gt;_water_leak</w:t>
       </w:r>
       <w:r>
+        <w:rPr/>
         <w:t xml:space="preserve"> / </w:t>
       </w:r>
       <w:r>
@@ -2236,6 +2458,7 @@
         <w:t>_contact</w:t>
       </w:r>
       <w:r>
+        <w:rPr/>
         <w:t xml:space="preserve">, </w:t>
       </w:r>
       <w:r>
@@ -2247,6 +2470,7 @@
         <w:t>_last_seen</w:t>
       </w:r>
       <w:r>
+        <w:rPr/>
         <w:t xml:space="preserve">, </w:t>
       </w:r>
       <w:r>
@@ -2258,6 +2482,7 @@
         <w:t>_available</w:t>
       </w:r>
       <w:r>
+        <w:rPr/>
         <w:t>.</w:t>
       </w:r>
     </w:p>
@@ -2269,21 +2494,86 @@
         <w:rPr>
           <w:b/>
         </w:rPr>
-        <w:t>Odświeżanie</w:t>
-      </w:r>
-      <w:r>
-        <w:t>: monitorowane czujniki raportują cyklicznie (co P3 min, domyślnie 15)</w:t>
+        <w:t>Odświeżanie — polityka raportowania (ważne przy ocenie „czy to nie zamarzło"):</w:t>
       </w:r>
     </w:p>
     <w:p>
-      <w:r>
-        <w:t>NIEZALEŻNIE od progów anomalii. Dodatkowo zdarzeniowo przy zmianie</w:t>
+      <w:pPr>
+        <w:pStyle w:val="ListBullet2"/>
+      </w:pPr>
+      <w:r>
+        <w:rPr>
+          <w:b/>
+        </w:rPr>
+        <w:t>Pomiarowe</w:t>
+      </w:r>
+      <w:r>
+        <w:rPr/>
+        <w:t xml:space="preserve"> (temperatura/wilgotność/bateria) — CYKLICZNIE co P3 min (domyślnie 15), niezależnie od progów, plus zdarzeniowo przy zmianie (≥0,5 °C / ≥2 %). Odczyt analogowy się starzeje, więc musi przychodzić sam z siebie.</w:t>
       </w:r>
     </w:p>
     <w:p>
-      <w:r>
-        <w:t xml:space="preserve">(≥0,5 °C / ≥2 %). </w:t>
-      </w:r>
+      <w:pPr>
+        <w:pStyle w:val="ListBullet2"/>
+      </w:pPr>
+      <w:r>
+        <w:rPr>
+          <w:b/>
+        </w:rPr>
+        <w:t>Binarne</w:t>
+      </w:r>
+      <w:r>
+        <w:rPr/>
+        <w:t xml:space="preserve"> (przekaźniki, drzwi, zalanie, ruch) — </w:t>
+      </w:r>
+      <w:r>
+        <w:rPr>
+          <w:b/>
+        </w:rPr>
+        <w:t>WYŁĄCZNIE zdarzeniowo</w:t>
+      </w:r>
+      <w:r>
+        <w:rPr/>
+        <w:t>. Stan binarny się nie starzeje; jego powtarzanie było mierzalnie 93 % pasma G1. To, że przekaźnik „milczy", jest poprawnym zachowaniem, nie awarią.</w:t>
+      </w:r>
+    </w:p>
+    <w:p>
+      <w:pPr>
+        <w:pStyle w:val="ListBullet2"/>
+      </w:pPr>
+      <w:r>
+        <w:rPr/>
+        <w:t xml:space="preserve">Że urządzenie ŻYJE, niesie osobny kanał: blob </w:t>
+      </w:r>
+      <w:r>
+        <w:rPr>
+          <w:rFonts w:ascii="Consolas" w:hAnsi="Consolas"/>
+          <w:color w:val="B03060"/>
+          <w:sz w:val="19"/>
+        </w:rPr>
+        <w:t>avail</w:t>
+      </w:r>
+      <w:r>
+        <w:rPr/>
+        <w:t xml:space="preserve"> (availability + LQI) i hash </w:t>
+      </w:r>
+      <w:r>
+        <w:rPr>
+          <w:rFonts w:ascii="Consolas" w:hAnsi="Consolas"/>
+          <w:color w:val="B03060"/>
+          <w:sz w:val="19"/>
+        </w:rPr>
+        <w:t>dh</w:t>
+      </w:r>
+      <w:r>
+        <w:rPr/>
+        <w:t>. Padnięcie całej bramki nadal wykrywają timeouty T1/T2/T3.</w:t>
+      </w:r>
+    </w:p>
+    <w:p>
+      <w:pPr>
+        <w:pStyle w:val="ListBullet2"/>
+      </w:pPr>
       <w:r>
         <w:rPr>
           <w:rFonts w:ascii="Consolas" w:hAnsi="Consolas"/>
@@ -2293,6 +2583,7 @@
         <w:t>last_seen</w:t>
       </w:r>
       <w:r>
+        <w:rPr/>
         <w:t xml:space="preserve"> = ostatni realny raport (uczciwy wskaźnik świeżości).</w:t>
       </w:r>
     </w:p>
@@ -2307,6 +2598,7 @@
         <w:t>Refresh ręczny</w:t>
       </w:r>
       <w:r>
+        <w:rPr/>
         <w:t xml:space="preserve">: </w:t>
       </w:r>
       <w:r>
@@ -2318,12 +2610,8 @@
         <w:t>button.lora_&lt;gw&gt;_&lt;dev&gt;_refresh</w:t>
       </w:r>
       <w:r>
-        <w:t xml:space="preserve"> → prosi bramkę o natychmiastową</w:t>
-      </w:r>
-    </w:p>
-    <w:p>
-      <w:r>
-        <w:t>wartość (przez LoRa).</w:t>
+        <w:rPr/>
+        <w:t xml:space="preserve"> → prosi bramkę o natychmiastową wartość (przez LoRa).</w:t>
       </w:r>
     </w:p>
     <w:p>
@@ -2331,6 +2619,7 @@
         <w:pStyle w:val="ListBullet"/>
       </w:pPr>
       <w:r>
+        <w:rPr/>
         <w:t xml:space="preserve">Kafle mają </w:t>
       </w:r>
       <w:r>
@@ -2342,6 +2631,7 @@
         <w:t>force_update</w:t>
       </w:r>
       <w:r>
+        <w:rPr/>
         <w:t xml:space="preserve"> → nie „zamarzają" nawet przy stałej wartości.</w:t>
       </w:r>
     </w:p>
@@ -2694,7 +2984,7 @@
         <w:t>edytuj pole → naciśnij przycisk Send</w:t>
       </w:r>
       <w:r>
-        <w:t xml:space="preserve"> (jak v38, nie auto-push). Silniki</w:t>
+        <w:t xml:space="preserve"> (jak w starej wersji, nie auto-push). Silniki</w:t>
       </w:r>
     </w:p>
     <w:p>
@@ -3261,9 +3551,9 @@
             <w:tcW w:type="dxa" w:w="2160"/>
           </w:tcPr>
           <w:p>
-            <w:r/>
             <w:r>
-              <w:t>25</w:t>
+              <w:rPr/>
+              <w:t>60</w:t>
             </w:r>
           </w:p>
         </w:tc>
@@ -3513,6 +3803,67 @@
     </w:p>
     <w:p>
       <w:pPr>
+        <w:ind w:left="432"/>
+      </w:pPr>
+      <w:r>
+        <w:rPr>
+          <w:b/>
+        </w:rPr>
+        <w:t>Wartości startowe nowej bramki</w:t>
+      </w:r>
+      <w:r>
+        <w:rPr/>
+        <w:t xml:space="preserve"> bierze się z </w:t>
+      </w:r>
+      <w:r>
+        <w:rPr>
+          <w:rFonts w:ascii="Consolas" w:hAnsi="Consolas"/>
+          <w:color w:val="B03060"/>
+          <w:sz w:val="19"/>
+        </w:rPr>
+        <w:t>params_preset</w:t>
+      </w:r>
+      <w:r>
+        <w:rPr/>
+        <w:t xml:space="preserve"> w </w:t>
+      </w:r>
+      <w:r>
+        <w:rPr>
+          <w:rFonts w:ascii="Consolas" w:hAnsi="Consolas"/>
+          <w:color w:val="B03060"/>
+          <w:sz w:val="19"/>
+        </w:rPr>
+        <w:t>config.py</w:t>
+      </w:r>
+      <w:r>
+        <w:rPr/>
+        <w:t xml:space="preserve"> tej maszyny (§9). Preset działa TYLKO gdy nie ma jeszcze </w:t>
+      </w:r>
+      <w:r>
+        <w:rPr>
+          <w:rFonts w:ascii="Consolas" w:hAnsi="Consolas"/>
+          <w:color w:val="B03060"/>
+          <w:sz w:val="19"/>
+        </w:rPr>
+        <w:t>/tmp/lora_params.json</w:t>
+      </w:r>
+      <w:r>
+        <w:rPr/>
+        <w:t xml:space="preserve"> — Twoje edycje z dashboardu zawsze wygrywają i restart ich nie cofa. </w:t>
+      </w:r>
+      <w:r>
+        <w:rPr>
+          <w:b/>
+        </w:rPr>
+        <w:t>T4 musi być dłuższy niż realny RTT łącza</w:t>
+      </w:r>
+      <w:r>
+        <w:rPr/>
+        <w:t xml:space="preserve"> (sup→gw bywa 16-72 s przy ruchu, bo jedna antena obsługuje wszystkie bramki). Timeout krótszy niż RTT nie wykrywa awarii — tworzy ją.</w:t>
+      </w:r>
+    </w:p>
+    <w:p>
+      <w:pPr>
         <w:pStyle w:val="Heading3"/>
       </w:pPr>
       <w:r>
@@ -3647,7 +3998,9 @@
       </w:r>
     </w:p>
     <w:p>
-      <w:r>
+      <w:pPr/>
+      <w:r>
+        <w:rPr/>
         <w:t>HB (uptime, liczba urządzeń mon/pri), jakość czasu (</w:t>
       </w:r>
       <w:r>
@@ -3659,12 +4012,8 @@
         <w:t>tq</w:t>
       </w:r>
       <w:r>
-        <w:t>), pora dnia, link do</w:t>
-      </w:r>
-    </w:p>
-    <w:p>
-      <w:r>
-        <w:t xml:space="preserve">supervisora, oraz </w:t>
+        <w:rPr/>
+        <w:t xml:space="preserve">), pora dnia, link do supervisora, oraz </w:t>
       </w:r>
       <w:r>
         <w:rPr>
@@ -3673,7 +4022,708 @@
         <w:t>hashe zgodności</w:t>
       </w:r>
       <w:r>
-        <w:t xml:space="preserve"> (disc/param/cal/anomaly = „zgodny ✅ / ROZJAZD ⚠️").</w:t>
+        <w:rPr/>
+        <w:t xml:space="preserve"> — pięć równorzędnych flag („zgodny ✅ / ROZJAZD ⚠️"):</w:t>
+      </w:r>
+    </w:p>
+    <w:tbl>
+      <w:tblPr>
+        <w:tblStyle w:val="LightGrid-Accent1"/>
+        <w:tblW w:type="auto" w:w="0"/>
+        <w:tblLook w:firstColumn="1" w:firstRow="1" w:lastColumn="0" w:lastRow="0" w:noHBand="0" w:noVBand="1" w:val="04A0"/>
+      </w:tblPr>
+      <w:tblGrid>
+        <w:gridCol w:w="2880"/>
+        <w:gridCol w:w="2880"/>
+        <w:gridCol w:w="2880"/>
+      </w:tblGrid>
+      <w:tr>
+        <w:tc>
+          <w:tcPr>
+            <w:tcW w:type="dxa" w:w="2880"/>
+          </w:tcPr>
+          <w:p>
+            <w:r>
+              <w:rPr>
+                <w:b/>
+              </w:rPr>
+              <w:t>Flaga</w:t>
+            </w:r>
+          </w:p>
+        </w:tc>
+        <w:tc>
+          <w:tcPr>
+            <w:tcW w:type="dxa" w:w="2880"/>
+          </w:tcPr>
+          <w:p>
+            <w:r>
+              <w:rPr>
+                <w:b/>
+              </w:rPr>
+              <w:t>Czego pilnuje</w:t>
+            </w:r>
+          </w:p>
+        </w:tc>
+        <w:tc>
+          <w:tcPr>
+            <w:tcW w:type="dxa" w:w="2880"/>
+          </w:tcPr>
+          <w:p>
+            <w:r>
+              <w:rPr>
+                <w:b/>
+              </w:rPr>
+              <w:t>Co robi system przy rozjeździe</w:t>
+            </w:r>
+          </w:p>
+        </w:tc>
+      </w:tr>
+      <w:tr>
+        <w:tc>
+          <w:tcPr>
+            <w:tcW w:type="dxa" w:w="2880"/>
+          </w:tcPr>
+          <w:p>
+            <w:r>
+              <w:rPr/>
+              <w:t>DISC</w:t>
+            </w:r>
+          </w:p>
+        </w:tc>
+        <w:tc>
+          <w:tcPr>
+            <w:tcW w:type="dxa" w:w="2880"/>
+          </w:tcPr>
+          <w:p>
+            <w:r>
+              <w:rPr/>
+              <w:t>mapa urządzeń (nazwa↔sid)</w:t>
+            </w:r>
+          </w:p>
+        </w:tc>
+        <w:tc>
+          <w:tcPr>
+            <w:tcW w:type="dxa" w:w="2880"/>
+          </w:tcPr>
+          <w:p>
+            <w:r>
+              <w:rPr/>
+              <w:t xml:space="preserve">dociąga </w:t>
+            </w:r>
+            <w:r>
+              <w:rPr>
+                <w:rFonts w:ascii="Consolas" w:hAnsi="Consolas"/>
+                <w:color w:val="B03060"/>
+                <w:sz w:val="19"/>
+              </w:rPr>
+              <w:t>devmap</w:t>
+            </w:r>
+          </w:p>
+        </w:tc>
+      </w:tr>
+      <w:tr>
+        <w:tc>
+          <w:tcPr>
+            <w:tcW w:type="dxa" w:w="2880"/>
+          </w:tcPr>
+          <w:p>
+            <w:r>
+              <w:rPr/>
+              <w:t>PARAM</w:t>
+            </w:r>
+          </w:p>
+        </w:tc>
+        <w:tc>
+          <w:tcPr>
+            <w:tcW w:type="dxa" w:w="2880"/>
+          </w:tcPr>
+          <w:p>
+            <w:r>
+              <w:rPr/>
+              <w:t>parametry P/T/Progi</w:t>
+            </w:r>
+          </w:p>
+        </w:tc>
+        <w:tc>
+          <w:tcPr>
+            <w:tcW w:type="dxa" w:w="2880"/>
+          </w:tcPr>
+          <w:p>
+            <w:r>
+              <w:rPr/>
+              <w:t>auto-heal (pull od mastera)</w:t>
+            </w:r>
+          </w:p>
+        </w:tc>
+      </w:tr>
+      <w:tr>
+        <w:tc>
+          <w:tcPr>
+            <w:tcW w:type="dxa" w:w="2880"/>
+          </w:tcPr>
+          <w:p>
+            <w:r>
+              <w:rPr/>
+              <w:t>KALENDARZ</w:t>
+            </w:r>
+          </w:p>
+        </w:tc>
+        <w:tc>
+          <w:tcPr>
+            <w:tcW w:type="dxa" w:w="2880"/>
+          </w:tcPr>
+          <w:p>
+            <w:r>
+              <w:rPr/>
+              <w:t>harmonogram produkcji</w:t>
+            </w:r>
+          </w:p>
+        </w:tc>
+        <w:tc>
+          <w:tcPr>
+            <w:tcW w:type="dxa" w:w="2880"/>
+          </w:tcPr>
+          <w:p>
+            <w:r>
+              <w:rPr/>
+              <w:t>push/pull na przycisk</w:t>
+            </w:r>
+          </w:p>
+        </w:tc>
+      </w:tr>
+      <w:tr>
+        <w:tc>
+          <w:tcPr>
+            <w:tcW w:type="dxa" w:w="2880"/>
+          </w:tcPr>
+          <w:p>
+            <w:r>
+              <w:rPr/>
+              <w:t>ANOMALIE</w:t>
+            </w:r>
+          </w:p>
+        </w:tc>
+        <w:tc>
+          <w:tcPr>
+            <w:tcW w:type="dxa" w:w="2880"/>
+          </w:tcPr>
+          <w:p>
+            <w:r>
+              <w:rPr/>
+              <w:t>lista aktywnych anomalii</w:t>
+            </w:r>
+          </w:p>
+        </w:tc>
+        <w:tc>
+          <w:tcPr>
+            <w:tcW w:type="dxa" w:w="2880"/>
+          </w:tcPr>
+          <w:p>
+            <w:r>
+              <w:rPr>
+                <w:rFonts w:ascii="Consolas" w:hAnsi="Consolas"/>
+                <w:color w:val="B03060"/>
+                <w:sz w:val="19"/>
+              </w:rPr>
+              <w:t>dump_anom</w:t>
+            </w:r>
+            <w:r>
+              <w:rPr/>
+              <w:t xml:space="preserve"> → blob </w:t>
+            </w:r>
+            <w:r>
+              <w:rPr>
+                <w:rFonts w:ascii="Consolas" w:hAnsi="Consolas"/>
+                <w:color w:val="B03060"/>
+                <w:sz w:val="19"/>
+              </w:rPr>
+              <w:t>ansnap</w:t>
+            </w:r>
+          </w:p>
+        </w:tc>
+      </w:tr>
+      <w:tr>
+        <w:tc>
+          <w:tcPr>
+            <w:tcW w:type="dxa" w:w="2880"/>
+          </w:tcPr>
+          <w:p>
+            <w:r>
+              <w:rPr>
+                <w:b/>
+              </w:rPr>
+              <w:t>DANE</w:t>
+            </w:r>
+          </w:p>
+        </w:tc>
+        <w:tc>
+          <w:tcPr>
+            <w:tcW w:type="dxa" w:w="2880"/>
+          </w:tcPr>
+          <w:p>
+            <w:r>
+              <w:rPr/>
+              <w:t>stan urządzeń (</w:t>
+            </w:r>
+            <w:r>
+              <w:rPr>
+                <w:rFonts w:ascii="Consolas" w:hAnsi="Consolas"/>
+                <w:color w:val="B03060"/>
+                <w:sz w:val="19"/>
+              </w:rPr>
+              <w:t>dh</w:t>
+            </w:r>
+            <w:r>
+              <w:rPr/>
+              <w:t>)</w:t>
+            </w:r>
+          </w:p>
+        </w:tc>
+        <w:tc>
+          <w:tcPr>
+            <w:tcW w:type="dxa" w:w="2880"/>
+          </w:tcPr>
+          <w:p>
+            <w:r>
+              <w:rPr/>
+              <w:t xml:space="preserve">dociąga pełny stan blobem </w:t>
+            </w:r>
+            <w:r>
+              <w:rPr>
+                <w:rFonts w:ascii="Consolas" w:hAnsi="Consolas"/>
+                <w:color w:val="B03060"/>
+                <w:sz w:val="19"/>
+              </w:rPr>
+              <w:t>dsnap</w:t>
+            </w:r>
+            <w:r>
+              <w:rPr/>
+              <w:t xml:space="preserve"> — tylko po potwierdzonym rozjeździe (§5.6)</w:t>
+            </w:r>
+          </w:p>
+        </w:tc>
+      </w:tr>
+    </w:tbl>
+    <w:p>
+      <w:pPr/>
+    </w:p>
+    <w:p>
+      <w:pPr/>
+      <w:r>
+        <w:rPr/>
+        <w:t>Flaga DANE ma sens dopiero odkąd binarne raportują tylko zdarzeniowo: skoro nie ma periodyku, to hash — a nie „coś w końcu przyjdzie" — pilnuje, żeby lustro supervisora nie rozjechało się po cichu.</w:t>
+      </w:r>
+    </w:p>
+    <w:p>
+      <w:pPr/>
+      <w:r>
+        <w:rPr>
+          <w:b/>
+        </w:rPr>
+        <w:t>Kafel czasu.</w:t>
+      </w:r>
+      <w:r>
+        <w:rPr/>
+        <w:t xml:space="preserve"> „Offset" to różnica zegarów PO odjęciu połowy czasu obiegu ping→pong (obok pokazany jest surowy RTT). Bez tej korekty kafel pokazywał całe opóźnienie LoRa (potrafiło być +21 s) i wyglądało to jak dryf zegara, którym nie było — obie maszyny mają NTP. Uczciwe zastrzeżenie: łącze jest asymetryczne, więc RTT/2 to przybliżenie; gdy chcesz mieć pewność co do zegarów, patrz na </w:t>
+      </w:r>
+      <w:r>
+        <w:rPr>
+          <w:rFonts w:ascii="Consolas" w:hAnsi="Consolas"/>
+          <w:color w:val="B03060"/>
+          <w:sz w:val="19"/>
+        </w:rPr>
+        <w:t>tq</w:t>
+      </w:r>
+      <w:r>
+        <w:rPr/>
+        <w:t xml:space="preserve"> (jakość czasu), nie na offset.</w:t>
+      </w:r>
+    </w:p>
+    <w:p>
+      <w:pPr>
+        <w:pStyle w:val="Heading3"/>
+      </w:pPr>
+      <w:r>
+        <w:rPr/>
+        <w:t>5.6 Synchronizacja stanu (v12.3–v12.11)</w:t>
+      </w:r>
+    </w:p>
+    <w:p>
+      <w:pPr>
+        <w:pStyle w:val="ListBullet"/>
+      </w:pPr>
+      <w:r>
+        <w:rPr>
+          <w:b/>
+        </w:rPr>
+        <w:t>Hash w ramkach.</w:t>
+      </w:r>
+      <w:r>
+        <w:rPr/>
+        <w:t xml:space="preserve"> Ostatnia ramka danych </w:t>
+      </w:r>
+      <w:r>
+        <w:rPr>
+          <w:rFonts w:ascii="Consolas" w:hAnsi="Consolas"/>
+          <w:color w:val="B03060"/>
+          <w:sz w:val="19"/>
+        </w:rPr>
+        <w:t>b</w:t>
+      </w:r>
+      <w:r>
+        <w:rPr/>
+        <w:t xml:space="preserve"> oraz potwierdzenie komendy </w:t>
+      </w:r>
+      <w:r>
+        <w:rPr>
+          <w:rFonts w:ascii="Consolas" w:hAnsi="Consolas"/>
+          <w:color w:val="B03060"/>
+          <w:sz w:val="19"/>
+        </w:rPr>
+        <w:t>st</w:t>
+      </w:r>
+      <w:r>
+        <w:rPr/>
+        <w:t>/</w:t>
+      </w:r>
+      <w:r>
+        <w:rPr>
+          <w:rFonts w:ascii="Consolas" w:hAnsi="Consolas"/>
+          <w:color w:val="B03060"/>
+          <w:sz w:val="19"/>
+        </w:rPr>
+        <w:t>stm</w:t>
+      </w:r>
+      <w:r>
+        <w:rPr/>
+        <w:t xml:space="preserve"> niosą </w:t>
+      </w:r>
+      <w:r>
+        <w:rPr>
+          <w:rFonts w:ascii="Consolas" w:hAnsi="Consolas"/>
+          <w:color w:val="B03060"/>
+          <w:sz w:val="19"/>
+        </w:rPr>
+        <w:t>dh</w:t>
+      </w:r>
+      <w:r>
+        <w:rPr/>
+        <w:t>/</w:t>
+      </w:r>
+      <w:r>
+        <w:rPr>
+          <w:rFonts w:ascii="Consolas" w:hAnsi="Consolas"/>
+          <w:color w:val="B03060"/>
+          <w:sz w:val="19"/>
+        </w:rPr>
+        <w:t>sh</w:t>
+      </w:r>
+      <w:r>
+        <w:rPr/>
+        <w:t xml:space="preserve"> (gdy nic więcej nie czeka w kolejce, ≤150 B). Supervisor przyjmuje hash tylko, gdy zgadza się z lustrem po nałożeniu zmian → flaga DANE zgodna od razu po sterowaniu.</w:t>
+      </w:r>
+    </w:p>
+    <w:p>
+      <w:pPr>
+        <w:pStyle w:val="ListBullet"/>
+      </w:pPr>
+      <w:r>
+        <w:rPr>
+          <w:rFonts w:ascii="Consolas" w:hAnsi="Consolas"/>
+          <w:b/>
+          <w:color w:val="B03060"/>
+          <w:sz w:val="19"/>
+        </w:rPr>
+        <w:t>dsnap</w:t>
+      </w:r>
+      <w:r>
+        <w:rPr>
+          <w:b/>
+        </w:rPr>
+        <w:t xml:space="preserve"> tylko po potwierdzonym rozjeździe.</w:t>
+      </w:r>
+      <w:r>
+        <w:rPr/>
+        <w:t xml:space="preserve"> Supervisor zamawia pełny stan dopiero, gdy dwa kolejne świeże HB/pongi niosą ten sam rozjazd (klucz: </w:t>
+      </w:r>
+      <w:r>
+        <w:rPr>
+          <w:rFonts w:ascii="Consolas" w:hAnsi="Consolas"/>
+          <w:color w:val="B03060"/>
+          <w:sz w:val="19"/>
+        </w:rPr>
+        <w:t>dh</w:t>
+      </w:r>
+      <w:r>
+        <w:rPr/>
+        <w:t xml:space="preserve">, </w:t>
+      </w:r>
+      <w:r>
+        <w:rPr>
+          <w:rFonts w:ascii="Consolas" w:hAnsi="Consolas"/>
+          <w:color w:val="B03060"/>
+          <w:sz w:val="19"/>
+        </w:rPr>
+        <w:t>sh</w:t>
+      </w:r>
+      <w:r>
+        <w:rPr/>
+        <w:t xml:space="preserve">, hash lustra), i nie zamawia go na podstawie starego hasha po transferze. Zniknęła pętla </w:t>
+      </w:r>
+      <w:r>
+        <w:rPr>
+          <w:rFonts w:ascii="Consolas" w:hAnsi="Consolas"/>
+          <w:color w:val="B03060"/>
+          <w:sz w:val="19"/>
+        </w:rPr>
+        <w:t>dsnap</w:t>
+      </w:r>
+      <w:r>
+        <w:rPr/>
+        <w:t xml:space="preserve"> G1 co 180 s.</w:t>
+      </w:r>
+    </w:p>
+    <w:p>
+      <w:pPr>
+        <w:pStyle w:val="ListBullet"/>
+      </w:pPr>
+      <w:r>
+        <w:rPr>
+          <w:b/>
+        </w:rPr>
+        <w:t>Spóźnione ramki odrzucane.</w:t>
+      </w:r>
+      <w:r>
+        <w:rPr/>
+        <w:t xml:space="preserve"> Antena supervisora po restarcie potrafi oddać ramki sprzed minut/dni; ramka </w:t>
+      </w:r>
+      <w:r>
+        <w:rPr>
+          <w:rFonts w:ascii="Consolas" w:hAnsi="Consolas"/>
+          <w:color w:val="B03060"/>
+          <w:sz w:val="19"/>
+        </w:rPr>
+        <w:t>b</w:t>
+      </w:r>
+      <w:r>
+        <w:rPr/>
+        <w:t xml:space="preserve"> starsza niż ostatnio zastosowana dla urządzenia nie cofa lustra (</w:t>
+      </w:r>
+      <w:r>
+        <w:rPr>
+          <w:rFonts w:ascii="Consolas" w:hAnsi="Consolas"/>
+          <w:color w:val="B03060"/>
+          <w:sz w:val="19"/>
+        </w:rPr>
+        <w:t>dsnap</w:t>
+      </w:r>
+      <w:r>
+        <w:rPr/>
+        <w:t xml:space="preserve"> resetuje ten licznik).</w:t>
+      </w:r>
+    </w:p>
+    <w:p>
+      <w:pPr>
+        <w:pStyle w:val="ListBullet"/>
+      </w:pPr>
+      <w:r>
+        <w:rPr>
+          <w:b/>
+        </w:rPr>
+        <w:t>Discovery z hashem.</w:t>
+      </w:r>
+      <w:r>
+        <w:rPr/>
+        <w:t xml:space="preserve"> Przycisk Discovery (per bramka i „all”) na supervisorze wysyła znany hash mapy; zgodny → bramka odsyła samą </w:t>
+      </w:r>
+      <w:r>
+        <w:rPr>
+          <w:rFonts w:ascii="Consolas" w:hAnsi="Consolas"/>
+          <w:color w:val="B03060"/>
+          <w:sz w:val="19"/>
+        </w:rPr>
+        <w:t>disc_meta</w:t>
+      </w:r>
+      <w:r>
+        <w:rPr/>
+        <w:t xml:space="preserve">, bez pełnej devmapy (2–3 min kanału). Przycisk Discovery na bramce działa tak samo (flaga DISC z </w:t>
+      </w:r>
+      <w:r>
+        <w:rPr>
+          <w:rFonts w:ascii="Consolas" w:hAnsi="Consolas"/>
+          <w:color w:val="B03060"/>
+          <w:sz w:val="19"/>
+        </w:rPr>
+        <w:t>zg</w:t>
+      </w:r>
+      <w:r>
+        <w:rPr/>
+        <w:t xml:space="preserve"> dla tej samej mapy). W trybie „sama meta” nie idzie też </w:t>
+      </w:r>
+      <w:r>
+        <w:rPr>
+          <w:rFonts w:ascii="Consolas" w:hAnsi="Consolas"/>
+          <w:color w:val="B03060"/>
+          <w:sz w:val="19"/>
+        </w:rPr>
+        <w:t>disc_vio</w:t>
+      </w:r>
+      <w:r>
+        <w:rPr/>
+        <w:t xml:space="preserve"> — pełna mapa poleci, gdy mapa na bramce się zmieni albo supervisor nie ma kompletnego lustra.</w:t>
+      </w:r>
+    </w:p>
+    <w:p>
+      <w:pPr>
+        <w:pStyle w:val="ListBullet"/>
+      </w:pPr>
+      <w:r>
+        <w:rPr>
+          <w:b/>
+        </w:rPr>
+        <w:t>Trwałe lustro supervisora</w:t>
+      </w:r>
+      <w:r>
+        <w:rPr/>
+        <w:t xml:space="preserve"> </w:t>
+      </w:r>
+      <w:r>
+        <w:rPr>
+          <w:rFonts w:ascii="Consolas" w:hAnsi="Consolas"/>
+          <w:color w:val="B03060"/>
+          <w:sz w:val="19"/>
+        </w:rPr>
+        <w:t>/tmp/lora_sup_mirror.json</w:t>
+      </w:r>
+      <w:r>
+        <w:rPr/>
+        <w:t xml:space="preserve"> (zapis co 30 s, gdy była zmiana). Restart supervisora nie wymaga </w:t>
+      </w:r>
+      <w:r>
+        <w:rPr>
+          <w:rFonts w:ascii="Consolas" w:hAnsi="Consolas"/>
+          <w:color w:val="B03060"/>
+          <w:sz w:val="19"/>
+        </w:rPr>
+        <w:t>dsnap</w:t>
+      </w:r>
+      <w:r>
+        <w:rPr/>
+        <w:t xml:space="preserve"> — G1/G2 zgodne po kilkudziesięciu sekundach. Pierwszy start BEZ pliku: hydratacja z retained HA może wnieść stare stany → jeden </w:t>
+      </w:r>
+      <w:r>
+        <w:rPr>
+          <w:rFonts w:ascii="Consolas" w:hAnsi="Consolas"/>
+          <w:color w:val="B03060"/>
+          <w:sz w:val="19"/>
+        </w:rPr>
+        <w:t>dsnap</w:t>
+      </w:r>
+      <w:r>
+        <w:rPr/>
+        <w:t>.</w:t>
+      </w:r>
+    </w:p>
+    <w:p>
+      <w:pPr>
+        <w:pStyle w:val="ListBullet"/>
+      </w:pPr>
+      <w:r>
+        <w:rPr>
+          <w:b/>
+        </w:rPr>
+        <w:t>Szybki pas</w:t>
+      </w:r>
+      <w:r>
+        <w:rPr/>
+        <w:t xml:space="preserve"> (ping/pong/sterowanie/parametry/</w:t>
+      </w:r>
+      <w:r>
+        <w:rPr>
+          <w:rFonts w:ascii="Consolas" w:hAnsi="Consolas"/>
+          <w:color w:val="B03060"/>
+          <w:sz w:val="19"/>
+        </w:rPr>
+        <w:t>an_d</w:t>
+      </w:r>
+      <w:r>
+        <w:rPr/>
+        <w:t xml:space="preserve">) wychodzi poza slotem z LBT, ale omija slot INNEJ aktywnej bramki (G2 nie słyszy G1 — ukryty nadajnik; </w:t>
+      </w:r>
+      <w:r>
+        <w:rPr>
+          <w:rFonts w:ascii="Consolas" w:hAnsi="Consolas"/>
+          <w:color w:val="B03060"/>
+          <w:sz w:val="19"/>
+        </w:rPr>
+        <w:t>slotting.active</w:t>
+      </w:r>
+      <w:r>
+        <w:rPr/>
+        <w:t xml:space="preserve"> domyślnie </w:t>
+      </w:r>
+      <w:r>
+        <w:rPr>
+          <w:rFonts w:ascii="Consolas" w:hAnsi="Consolas"/>
+          <w:color w:val="B03060"/>
+          <w:sz w:val="19"/>
+        </w:rPr>
+        <w:t>[G1, G2]</w:t>
+      </w:r>
+      <w:r>
+        <w:rPr/>
+        <w:t xml:space="preserve">, </w:t>
+      </w:r>
+      <w:r>
+        <w:rPr>
+          <w:rFonts w:ascii="Consolas" w:hAnsi="Consolas"/>
+          <w:color w:val="B03060"/>
+          <w:sz w:val="19"/>
+        </w:rPr>
+        <w:t>fast_guard</w:t>
+      </w:r>
+      <w:r>
+        <w:rPr/>
+        <w:t xml:space="preserve"> 2 s). Potwierdzenia </w:t>
+      </w:r>
+      <w:r>
+        <w:rPr>
+          <w:rFonts w:ascii="Consolas" w:hAnsi="Consolas"/>
+          <w:color w:val="B03060"/>
+          <w:sz w:val="19"/>
+        </w:rPr>
+        <w:t>st</w:t>
+      </w:r>
+      <w:r>
+        <w:rPr/>
+        <w:t xml:space="preserve"> wychodzą po 3 s ciszy (sufit 20 s).</w:t>
+      </w:r>
+    </w:p>
+    <w:p>
+      <w:pPr>
+        <w:pStyle w:val="ListBullet"/>
+      </w:pPr>
+      <w:r>
+        <w:rPr>
+          <w:b/>
+        </w:rPr>
+        <w:t>v12.11:</w:t>
+      </w:r>
+      <w:r>
+        <w:rPr/>
+        <w:t xml:space="preserve"> supervisor wysyła polecenie parametrów raz (wcześniej 2× przez nakładające się subskrypcje MQTT; drugie nadanie zagłuszało </w:t>
+      </w:r>
+      <w:r>
+        <w:rPr>
+          <w:rFonts w:ascii="Consolas" w:hAnsi="Consolas"/>
+          <w:color w:val="B03060"/>
+          <w:sz w:val="19"/>
+        </w:rPr>
+        <w:t>param_upd</w:t>
+      </w:r>
+      <w:r>
+        <w:rPr/>
+        <w:t xml:space="preserve"> bramki).</w:t>
       </w:r>
     </w:p>
     <w:p>
@@ -3686,7 +4736,6 @@
     </w:p>
     <w:p>
       <w:pPr>
-        <w:spacing w:after="0" w:before="0"/>
         <w:ind w:left="216"/>
       </w:pPr>
       <w:r>
@@ -3699,7 +4748,6 @@
     </w:p>
     <w:p>
       <w:pPr>
-        <w:spacing w:after="0" w:before="0"/>
         <w:ind w:left="216"/>
       </w:pPr>
       <w:r>
@@ -3707,12 +4755,11 @@
           <w:rFonts w:ascii="Consolas" w:hAnsi="Consolas"/>
           <w:sz w:val="18"/>
         </w:rPr>
-        <w:t>ssh td@100.98.155.78 'pgrep -af "python -u test_step5_anomaly.py" | grep -v tmux'</w:t>
+        <w:t>ssh td@100.98.155.78 'pgrep -af "python -u Meshtastic_SCADA.py" | grep -v tmux'</w:t>
       </w:r>
     </w:p>
     <w:p>
       <w:pPr>
-        <w:spacing w:after="0" w:before="0"/>
         <w:ind w:left="216"/>
       </w:pPr>
       <w:r>
@@ -3725,7 +4772,6 @@
     </w:p>
     <w:p>
       <w:pPr>
-        <w:spacing w:after="0" w:before="0"/>
         <w:ind w:left="216"/>
       </w:pPr>
       <w:r>
@@ -3738,7 +4784,6 @@
     </w:p>
     <w:p>
       <w:pPr>
-        <w:spacing w:after="0" w:before="0"/>
         <w:ind w:left="216"/>
       </w:pPr>
       <w:r>
@@ -3751,7 +4796,6 @@
     </w:p>
     <w:p>
       <w:pPr>
-        <w:spacing w:after="0" w:before="0"/>
         <w:ind w:left="216"/>
       </w:pPr>
       <w:r>
@@ -3764,7 +4808,6 @@
     </w:p>
     <w:p>
       <w:pPr>
-        <w:spacing w:after="0" w:before="0"/>
         <w:ind w:left="216"/>
       </w:pPr>
       <w:r>
@@ -3777,7 +4820,6 @@
     </w:p>
     <w:p>
       <w:pPr>
-        <w:spacing w:after="0" w:before="0"/>
         <w:ind w:left="216"/>
       </w:pPr>
       <w:r>
@@ -3788,7 +4830,6 @@
         <w:t>ssh td@100.98.155.78 'curl -s -H "Authorization: Bearer $HA_TOKEN" http://localhost:8123/api/ ' # w skrypcie</w:t>
       </w:r>
     </w:p>
-    <w:p/>
     <w:p>
       <w:pPr>
         <w:pStyle w:val="Heading2"/>
@@ -4070,9 +5111,9 @@
             <w:tcW w:type="dxa" w:w="2160"/>
           </w:tcPr>
           <w:p>
-            <w:r/>
             <w:r>
-              <w:t>re-generuj dashboard / republish configu encji; ostatecznie restart HA MQTT</w:t>
+              <w:rPr/>
+              <w:t>republish configu encji (dashboardu NIE generować — §4); ostatecznie restart HA MQTT</w:t>
             </w:r>
           </w:p>
         </w:tc>
@@ -4497,7 +5538,6 @@
             <w:tcW w:type="dxa" w:w="4320"/>
           </w:tcPr>
           <w:p>
-            <w:r/>
             <w:r>
               <w:rPr>
                 <w:b/>
@@ -4511,7 +5551,6 @@
             <w:tcW w:type="dxa" w:w="4320"/>
           </w:tcPr>
           <w:p>
-            <w:r/>
             <w:r>
               <w:rPr>
                 <w:b/>
@@ -4527,7 +5566,6 @@
             <w:tcW w:type="dxa" w:w="4320"/>
           </w:tcPr>
           <w:p>
-            <w:r/>
             <w:r>
               <w:rPr>
                 <w:rFonts w:ascii="Consolas" w:hAnsi="Consolas"/>
@@ -4543,8 +5581,8 @@
             <w:tcW w:type="dxa" w:w="4320"/>
           </w:tcPr>
           <w:p>
-            <w:r/>
             <w:r>
+              <w:rPr/>
               <w:t>parametry P/T/Progi (bramka = master)</w:t>
             </w:r>
           </w:p>
@@ -4556,7 +5594,6 @@
             <w:tcW w:type="dxa" w:w="4320"/>
           </w:tcPr>
           <w:p>
-            <w:r/>
             <w:r>
               <w:rPr>
                 <w:rFonts w:ascii="Consolas" w:hAnsi="Consolas"/>
@@ -4572,8 +5609,8 @@
             <w:tcW w:type="dxa" w:w="4320"/>
           </w:tcPr>
           <w:p>
-            <w:r/>
             <w:r>
+              <w:rPr/>
               <w:t>mirror parametrów per-bramka (supervisor)</w:t>
             </w:r>
           </w:p>
@@ -4585,7 +5622,6 @@
             <w:tcW w:type="dxa" w:w="4320"/>
           </w:tcPr>
           <w:p>
-            <w:r/>
             <w:r>
               <w:rPr>
                 <w:rFonts w:ascii="Consolas" w:hAnsi="Consolas"/>
@@ -4601,8 +5637,8 @@
             <w:tcW w:type="dxa" w:w="4320"/>
           </w:tcPr>
           <w:p>
-            <w:r/>
             <w:r>
+              <w:rPr/>
               <w:t xml:space="preserve">zapamiętany tryb bramki (ładowany ponad </w:t>
             </w:r>
             <w:r>
@@ -4614,6 +5650,7 @@
               <w:t>config.py</w:t>
             </w:r>
             <w:r>
+              <w:rPr/>
               <w:t>)</w:t>
             </w:r>
           </w:p>
@@ -4625,7 +5662,6 @@
             <w:tcW w:type="dxa" w:w="4320"/>
           </w:tcPr>
           <w:p>
-            <w:r/>
             <w:r>
               <w:rPr>
                 <w:rFonts w:ascii="Consolas" w:hAnsi="Consolas"/>
@@ -4641,7 +5677,6 @@
             <w:tcW w:type="dxa" w:w="4320"/>
           </w:tcPr>
           <w:p>
-            <w:r/>
             <w:r>
               <w:rPr>
                 <w:b/>
@@ -4649,6 +5684,7 @@
               <w:t>trwała mapa nazwa→sid</w:t>
             </w:r>
             <w:r>
+              <w:rPr/>
               <w:t xml:space="preserve"> (stabilne sidy)</w:t>
             </w:r>
           </w:p>
@@ -4660,7 +5696,6 @@
             <w:tcW w:type="dxa" w:w="4320"/>
           </w:tcPr>
           <w:p>
-            <w:r/>
             <w:r>
               <w:rPr>
                 <w:rFonts w:ascii="Consolas" w:hAnsi="Consolas"/>
@@ -4676,8 +5711,8 @@
             <w:tcW w:type="dxa" w:w="4320"/>
           </w:tcPr>
           <w:p>
-            <w:r/>
             <w:r>
+              <w:rPr/>
               <w:t>aktywne anomalie</w:t>
             </w:r>
           </w:p>
@@ -4689,7 +5724,6 @@
             <w:tcW w:type="dxa" w:w="4320"/>
           </w:tcPr>
           <w:p>
-            <w:r/>
             <w:r>
               <w:rPr>
                 <w:rFonts w:ascii="Consolas" w:hAnsi="Consolas"/>
@@ -4705,8 +5739,8 @@
             <w:tcW w:type="dxa" w:w="4320"/>
           </w:tcPr>
           <w:p>
-            <w:r/>
             <w:r>
+              <w:rPr/>
               <w:t>harmonogram (kalendarz)</w:t>
             </w:r>
           </w:p>
@@ -4718,7 +5752,62 @@
             <w:tcW w:type="dxa" w:w="4320"/>
           </w:tcPr>
           <w:p>
-            <w:r/>
+            <w:r>
+              <w:rPr>
+                <w:rFonts w:ascii="Consolas" w:hAnsi="Consolas"/>
+                <w:color w:val="B03060"/>
+                <w:sz w:val="19"/>
+              </w:rPr>
+              <w:t>/tmp/lora_sup_mirror.json</w:t>
+            </w:r>
+          </w:p>
+        </w:tc>
+        <w:tc>
+          <w:tcPr>
+            <w:tcW w:type="dxa" w:w="4320"/>
+          </w:tcPr>
+          <w:p>
+            <w:r>
+              <w:rPr/>
+              <w:t>trwałe lustro stanów urządzeń (supervisor, v12.7)</w:t>
+            </w:r>
+          </w:p>
+        </w:tc>
+      </w:tr>
+      <w:tr>
+        <w:tc>
+          <w:tcPr>
+            <w:tcW w:type="dxa" w:w="4320"/>
+          </w:tcPr>
+          <w:p>
+            <w:r>
+              <w:rPr>
+                <w:rFonts w:ascii="Consolas" w:hAnsi="Consolas"/>
+                <w:color w:val="B03060"/>
+                <w:sz w:val="19"/>
+              </w:rPr>
+              <w:t>/tmp/lora_sup_devices.json</w:t>
+            </w:r>
+          </w:p>
+        </w:tc>
+        <w:tc>
+          <w:tcPr>
+            <w:tcW w:type="dxa" w:w="4320"/>
+          </w:tcPr>
+          <w:p>
+            <w:r>
+              <w:rPr/>
+              <w:t>mapy urządzeń + zsynchronizowane hashe per bramka (supervisor)</w:t>
+            </w:r>
+          </w:p>
+        </w:tc>
+      </w:tr>
+      <w:tr>
+        <w:tc>
+          <w:tcPr>
+            <w:tcW w:type="dxa" w:w="4320"/>
+          </w:tcPr>
+          <w:p>
             <w:r>
               <w:rPr>
                 <w:rFonts w:ascii="Consolas" w:hAnsi="Consolas"/>
@@ -4734,9 +5823,9 @@
             <w:tcW w:type="dxa" w:w="4320"/>
           </w:tcPr>
           <w:p>
-            <w:r/>
             <w:r>
-              <w:t xml:space="preserve">log runtime skryptu </w:t>
+              <w:rPr/>
+              <w:t xml:space="preserve">log runtime (+ </w:t>
             </w:r>
             <w:r>
               <w:rPr>
@@ -4744,19 +5833,502 @@
                 <w:color w:val="B03060"/>
                 <w:sz w:val="19"/>
               </w:rPr>
-              <w:t>test_*</w:t>
+              <w:t>/tmp/test_transport.stderr.log</w:t>
+            </w:r>
+            <w:r>
+              <w:rPr/>
+              <w:t>)</w:t>
+            </w:r>
+          </w:p>
+        </w:tc>
+      </w:tr>
+      <w:tr>
+        <w:tc>
+          <w:tcPr>
+            <w:tcW w:type="dxa" w:w="4320"/>
+          </w:tcPr>
+          <w:p>
+            <w:r>
+              <w:rPr>
+                <w:rFonts w:ascii="Consolas" w:hAnsi="Consolas"/>
+                <w:color w:val="B03060"/>
+                <w:sz w:val="19"/>
+              </w:rPr>
+              <w:t>/tmp/lora_air.log</w:t>
+            </w:r>
+          </w:p>
+        </w:tc>
+        <w:tc>
+          <w:tcPr>
+            <w:tcW w:type="dxa" w:w="4320"/>
+          </w:tcPr>
+          <w:p>
+            <w:r>
+              <w:rPr/>
+              <w:t>log faktycznego nadania ramek w eter</w:t>
             </w:r>
           </w:p>
         </w:tc>
       </w:tr>
     </w:tbl>
-    <w:p/>
+    <w:p>
+      <w:pPr/>
+    </w:p>
     <w:p>
       <w:pPr>
         <w:pStyle w:val="Heading2"/>
       </w:pPr>
       <w:r>
-        <w:t>9. Zasady bezpieczeństwa operacyjnego</w:t>
+        <w:rPr/>
+        <w:t>9. Pierwsze uruchomienie nowej bramki (checklista wdrożeniowa)</w:t>
+      </w:r>
+    </w:p>
+    <w:p>
+      <w:pPr/>
+      <w:r>
+        <w:rPr/>
+        <w:t>Zakłada gotowy sprzęt: Debian + Home Assistant Supervised + Zigbee2MQTT + Heltec V3 na USB. Kolejność jest istotna — każdy krok zdejmuje jedną klasę „dlaczego to nie działa".</w:t>
+      </w:r>
+    </w:p>
+    <w:p>
+      <w:pPr>
+        <w:pStyle w:val="ListNumber"/>
+      </w:pPr>
+      <w:r>
+        <w:rPr>
+          <w:b/>
+        </w:rPr>
+        <w:t>Broker MQTT</w:t>
+      </w:r>
+      <w:r>
+        <w:rPr/>
+        <w:t xml:space="preserve"> — user </w:t>
+      </w:r>
+      <w:r>
+        <w:rPr>
+          <w:rFonts w:ascii="Consolas" w:hAnsi="Consolas"/>
+          <w:color w:val="B03060"/>
+          <w:sz w:val="19"/>
+        </w:rPr>
+        <w:t>mqtt</w:t>
+      </w:r>
+      <w:r>
+        <w:rPr/>
+        <w:t xml:space="preserve"> z hasłem; broker widoczny pod </w:t>
+      </w:r>
+      <w:r>
+        <w:rPr>
+          <w:rFonts w:ascii="Consolas" w:hAnsi="Consolas"/>
+          <w:color w:val="B03060"/>
+          <w:sz w:val="19"/>
+        </w:rPr>
+        <w:t>172.17.0.1:1883</w:t>
+      </w:r>
+      <w:r>
+        <w:rPr/>
+        <w:t xml:space="preserve"> (adres hosta z kontenera HA). Sprawdź </w:t>
+      </w:r>
+      <w:r>
+        <w:rPr>
+          <w:rFonts w:ascii="Consolas" w:hAnsi="Consolas"/>
+          <w:color w:val="B03060"/>
+          <w:sz w:val="19"/>
+        </w:rPr>
+        <w:t>mosquitto_sub -t 'zigbee2mqtt/#' -C 1</w:t>
+      </w:r>
+      <w:r>
+        <w:rPr/>
+        <w:t>.</w:t>
+      </w:r>
+    </w:p>
+    <w:p>
+      <w:pPr>
+        <w:pStyle w:val="ListNumber"/>
+      </w:pPr>
+      <w:r>
+        <w:rPr>
+          <w:b/>
+        </w:rPr>
+        <w:t>Availability w Zigbee2MQTT</w:t>
+      </w:r>
+      <w:r>
+        <w:rPr/>
+        <w:t xml:space="preserve"> — MUSI być włączone, inaczej bramka nie odróżni „urządzenie milczy, bo się nie zmieniło" od „urządzenie padło". ⚠️ z2m 2.x </w:t>
+      </w:r>
+      <w:r>
+        <w:rPr>
+          <w:b/>
+        </w:rPr>
+        <w:t>ignoruje</w:t>
+      </w:r>
+      <w:r>
+        <w:rPr/>
+        <w:t xml:space="preserve"> </w:t>
+      </w:r>
+      <w:r>
+        <w:rPr>
+          <w:rFonts w:ascii="Consolas" w:hAnsi="Consolas"/>
+          <w:color w:val="B03060"/>
+          <w:sz w:val="19"/>
+        </w:rPr>
+        <w:t>availability: enabled</w:t>
+      </w:r>
+      <w:r>
+        <w:rPr/>
+        <w:t xml:space="preserve"> w </w:t>
+      </w:r>
+      <w:r>
+        <w:rPr>
+          <w:rFonts w:ascii="Consolas" w:hAnsi="Consolas"/>
+          <w:color w:val="B03060"/>
+          <w:sz w:val="19"/>
+        </w:rPr>
+        <w:t>configuration.yaml</w:t>
+      </w:r>
+      <w:r>
+        <w:rPr/>
+        <w:t>. Włącza się to przez broker i dopiero wtedy jest trwałe:</w:t>
+      </w:r>
+    </w:p>
+    <w:p>
+      <w:pPr>
+        <w:ind w:left="216"/>
+      </w:pPr>
+      <w:r>
+        <w:rPr>
+          <w:rFonts w:ascii="Consolas" w:hAnsi="Consolas"/>
+          <w:sz w:val="18"/>
+        </w:rPr>
+        <w:t>topic:   zigbee2mqtt/bridge/request/options</w:t>
+      </w:r>
+    </w:p>
+    <w:p>
+      <w:pPr>
+        <w:ind w:left="216"/>
+      </w:pPr>
+      <w:r>
+        <w:rPr>
+          <w:rFonts w:ascii="Consolas" w:hAnsi="Consolas"/>
+          <w:sz w:val="18"/>
+        </w:rPr>
+        <w:t>payload: {"options":{"availability":{"enabled":true,</w:t>
+      </w:r>
+    </w:p>
+    <w:p>
+      <w:pPr>
+        <w:ind w:left="216"/>
+      </w:pPr>
+      <w:r>
+        <w:rPr>
+          <w:rFonts w:ascii="Consolas" w:hAnsi="Consolas"/>
+          <w:sz w:val="18"/>
+        </w:rPr>
+        <w:t xml:space="preserve">          "active":{"timeout":10},"passive":{"timeout":1440}}}}</w:t>
+      </w:r>
+    </w:p>
+    <w:p>
+      <w:pPr/>
+      <w:r>
+        <w:rPr/>
+        <w:t>potem restart z2m.</w:t>
+      </w:r>
+    </w:p>
+    <w:p>
+      <w:pPr>
+        <w:pStyle w:val="ListNumber"/>
+      </w:pPr>
+      <w:r>
+        <w:rPr>
+          <w:b/>
+        </w:rPr>
+        <w:t>Token HA</w:t>
+      </w:r>
+      <w:r>
+        <w:rPr/>
+        <w:t xml:space="preserve"> (long-lived) tej maszyny → </w:t>
+      </w:r>
+      <w:r>
+        <w:rPr>
+          <w:rFonts w:ascii="Consolas" w:hAnsi="Consolas"/>
+          <w:color w:val="B03060"/>
+          <w:sz w:val="19"/>
+        </w:rPr>
+        <w:t>HA_TOKEN_GW</w:t>
+      </w:r>
+      <w:r>
+        <w:rPr/>
+        <w:t xml:space="preserve"> w </w:t>
+      </w:r>
+      <w:r>
+        <w:rPr>
+          <w:rFonts w:ascii="Consolas" w:hAnsi="Consolas"/>
+          <w:color w:val="B03060"/>
+          <w:sz w:val="19"/>
+        </w:rPr>
+        <w:t>config.py</w:t>
+      </w:r>
+      <w:r>
+        <w:rPr/>
+        <w:t>.</w:t>
+      </w:r>
+    </w:p>
+    <w:p>
+      <w:pPr>
+        <w:pStyle w:val="ListNumber"/>
+      </w:pPr>
+      <w:r>
+        <w:rPr>
+          <w:b/>
+        </w:rPr>
+        <w:t>Kalendarz</w:t>
+      </w:r>
+      <w:r>
+        <w:rPr/>
+        <w:t xml:space="preserve"> — w HA bramki musi istnieć encja </w:t>
+      </w:r>
+      <w:r>
+        <w:rPr>
+          <w:rFonts w:ascii="Consolas" w:hAnsi="Consolas"/>
+          <w:color w:val="B03060"/>
+          <w:sz w:val="19"/>
+        </w:rPr>
+        <w:t>calendar.lora_&lt;gw&gt;</w:t>
+      </w:r>
+      <w:r>
+        <w:rPr/>
+        <w:t xml:space="preserve"> (integracja Local Calendar). Nazwa wylicza się z </w:t>
+      </w:r>
+      <w:r>
+        <w:rPr>
+          <w:rFonts w:ascii="Consolas" w:hAnsi="Consolas"/>
+          <w:color w:val="B03060"/>
+          <w:sz w:val="19"/>
+        </w:rPr>
+        <w:t>id</w:t>
+      </w:r>
+      <w:r>
+        <w:rPr/>
+        <w:t xml:space="preserve"> bramki, nie ustawia się jej ręcznie. Reload kalendarza idzie przez </w:t>
+      </w:r>
+      <w:r>
+        <w:rPr>
+          <w:rFonts w:ascii="Consolas" w:hAnsi="Consolas"/>
+          <w:color w:val="B03060"/>
+          <w:sz w:val="19"/>
+        </w:rPr>
+        <w:t>config_entries</w:t>
+      </w:r>
+      <w:r>
+        <w:rPr/>
+        <w:t xml:space="preserve">; przy odmowie dostępu do </w:t>
+      </w:r>
+      <w:r>
+        <w:rPr>
+          <w:rFonts w:ascii="Consolas" w:hAnsi="Consolas"/>
+          <w:color w:val="B03060"/>
+          <w:sz w:val="19"/>
+        </w:rPr>
+        <w:t>.storage</w:t>
+      </w:r>
+      <w:r>
+        <w:rPr/>
+        <w:t xml:space="preserve"> potrzebny bywa jednorazowy chmod (znany wyjątek, opisany w historii projektu).</w:t>
+      </w:r>
+    </w:p>
+    <w:p>
+      <w:pPr>
+        <w:pStyle w:val="ListNumber"/>
+      </w:pPr>
+      <w:r>
+        <w:rPr>
+          <w:rFonts w:ascii="Consolas" w:hAnsi="Consolas"/>
+          <w:b/>
+          <w:color w:val="B03060"/>
+          <w:sz w:val="19"/>
+        </w:rPr>
+        <w:t>config.py</w:t>
+      </w:r>
+      <w:r>
+        <w:rPr>
+          <w:b/>
+        </w:rPr>
+        <w:t xml:space="preserve"> tej maszyny</w:t>
+      </w:r>
+      <w:r>
+        <w:rPr/>
+        <w:t xml:space="preserve"> — ustaw TYLKO: </w:t>
+      </w:r>
+      <w:r>
+        <w:rPr>
+          <w:rFonts w:ascii="Consolas" w:hAnsi="Consolas"/>
+          <w:color w:val="B03060"/>
+          <w:sz w:val="19"/>
+        </w:rPr>
+        <w:t>id</w:t>
+      </w:r>
+      <w:r>
+        <w:rPr/>
+        <w:t xml:space="preserve">, </w:t>
+      </w:r>
+      <w:r>
+        <w:rPr>
+          <w:rFonts w:ascii="Consolas" w:hAnsi="Consolas"/>
+          <w:color w:val="B03060"/>
+          <w:sz w:val="19"/>
+        </w:rPr>
+        <w:t>mesh_port</w:t>
+      </w:r>
+      <w:r>
+        <w:rPr/>
+        <w:t xml:space="preserve"> (ścieżka </w:t>
+      </w:r>
+      <w:r>
+        <w:rPr>
+          <w:rFonts w:ascii="Consolas" w:hAnsi="Consolas"/>
+          <w:color w:val="B03060"/>
+          <w:sz w:val="19"/>
+        </w:rPr>
+        <w:t>by-id</w:t>
+      </w:r>
+      <w:r>
+        <w:rPr/>
+        <w:t xml:space="preserve">, nie </w:t>
+      </w:r>
+      <w:r>
+        <w:rPr>
+          <w:rFonts w:ascii="Consolas" w:hAnsi="Consolas"/>
+          <w:color w:val="B03060"/>
+          <w:sz w:val="19"/>
+        </w:rPr>
+        <w:t>ttyUSB*</w:t>
+      </w:r>
+      <w:r>
+        <w:rPr/>
+        <w:t xml:space="preserve"> — nie renumeruje się po replug), </w:t>
+      </w:r>
+      <w:r>
+        <w:rPr>
+          <w:rFonts w:ascii="Consolas" w:hAnsi="Consolas"/>
+          <w:color w:val="B03060"/>
+          <w:sz w:val="19"/>
+        </w:rPr>
+        <w:t>monitored</w:t>
+      </w:r>
+      <w:r>
+        <w:rPr/>
+        <w:t xml:space="preserve">, </w:t>
+      </w:r>
+      <w:r>
+        <w:rPr>
+          <w:rFonts w:ascii="Consolas" w:hAnsi="Consolas"/>
+          <w:color w:val="B03060"/>
+          <w:sz w:val="19"/>
+        </w:rPr>
+        <w:t>priority_devices</w:t>
+      </w:r>
+      <w:r>
+        <w:rPr/>
+        <w:t xml:space="preserve">, sekrety oraz </w:t>
+      </w:r>
+      <w:r>
+        <w:rPr>
+          <w:rFonts w:ascii="Consolas" w:hAnsi="Consolas"/>
+          <w:b/>
+          <w:color w:val="B03060"/>
+          <w:sz w:val="19"/>
+        </w:rPr>
+        <w:t>params_preset</w:t>
+      </w:r>
+      <w:r>
+        <w:rPr/>
+        <w:t xml:space="preserve"> (§5.3). Reszta pliku jest wspólna. </w:t>
+      </w:r>
+      <w:r>
+        <w:rPr>
+          <w:rFonts w:ascii="Consolas" w:hAnsi="Consolas"/>
+          <w:color w:val="B03060"/>
+          <w:sz w:val="19"/>
+        </w:rPr>
+        <w:t>monitored</w:t>
+      </w:r>
+      <w:r>
+        <w:rPr/>
+        <w:t xml:space="preserve"> to nie „lista wszystkiego" — urządzenia spoza list nadal mają anomalie (offline/bateria/stagnacja), ale nie batchują danych. Na site'cie z ~200 urządzeń wrzucenie wszystkich do </w:t>
+      </w:r>
+      <w:r>
+        <w:rPr>
+          <w:rFonts w:ascii="Consolas" w:hAnsi="Consolas"/>
+          <w:color w:val="B03060"/>
+          <w:sz w:val="19"/>
+        </w:rPr>
+        <w:t>monitored</w:t>
+      </w:r>
+      <w:r>
+        <w:rPr/>
+        <w:t xml:space="preserve"> zapycha LoRa i wyłącza sens trybów bramki.</w:t>
+      </w:r>
+    </w:p>
+    <w:p>
+      <w:pPr>
+        <w:pStyle w:val="ListNumber"/>
+      </w:pPr>
+      <w:r>
+        <w:rPr>
+          <w:b/>
+        </w:rPr>
+        <w:t>Kod</w:t>
+      </w:r>
+      <w:r>
+        <w:rPr/>
+        <w:t xml:space="preserve"> — </w:t>
+      </w:r>
+      <w:r>
+        <w:rPr>
+          <w:rFonts w:ascii="Consolas" w:hAnsi="Consolas"/>
+          <w:color w:val="B03060"/>
+          <w:sz w:val="19"/>
+        </w:rPr>
+        <w:t>bash deploy/deploy_g1.sh &lt;ip&gt;</w:t>
+      </w:r>
+      <w:r>
+        <w:rPr/>
+        <w:t xml:space="preserve"> (§3.3). Skrypt sam waliduje składnię na maszynie przed restartem.</w:t>
+      </w:r>
+    </w:p>
+    <w:p>
+      <w:pPr>
+        <w:pStyle w:val="ListNumber"/>
+      </w:pPr>
+      <w:r>
+        <w:rPr>
+          <w:b/>
+        </w:rPr>
+        <w:t>Start i weryfikacja</w:t>
+      </w:r>
+      <w:r>
+        <w:rPr/>
+        <w:t xml:space="preserve"> — z launchera (§3.1), potem na supervisorze sprawdź: HB od nowej bramki, </w:t>
+      </w:r>
+      <w:r>
+        <w:rPr>
+          <w:rFonts w:ascii="Consolas" w:hAnsi="Consolas"/>
+          <w:color w:val="B03060"/>
+          <w:sz w:val="19"/>
+        </w:rPr>
+        <w:t>devmap</w:t>
+      </w:r>
+      <w:r>
+        <w:rPr/>
+        <w:t xml:space="preserve"> (mapa urządzeń), pięć flag zgodności na Diagnostyce.</w:t>
+      </w:r>
+    </w:p>
+    <w:p>
+      <w:pPr>
+        <w:pStyle w:val="Heading2"/>
+      </w:pPr>
+      <w:r>
+        <w:rPr/>
+        <w:t>10. Zasady bezpieczeństwa operacyjnego</w:t>
       </w:r>
     </w:p>
     <w:p>
@@ -4818,6 +6390,951 @@
       </w:pPr>
       <w:r>
         <w:t>Nie zmieniać stylu/mechanik dashboardu ad-hoc — trzymać się wzorca.</w:t>
+      </w:r>
+    </w:p>
+    <w:p>
+      <w:pPr>
+        <w:pStyle w:val="Heading2"/>
+      </w:pPr>
+      <w:r>
+        <w:rPr/>
+        <w:t>11. Narzędzia testowe (z PC, przez SSH — tylko G2 + supervisor)</w:t>
+      </w:r>
+    </w:p>
+    <w:tbl>
+      <w:tblPr>
+        <w:tblStyle w:val="LightGrid-Accent1"/>
+        <w:tblW w:type="auto" w:w="0"/>
+        <w:tblLook w:firstColumn="1" w:firstRow="1" w:lastColumn="0" w:lastRow="0" w:noHBand="0" w:noVBand="1" w:val="04A0"/>
+      </w:tblPr>
+      <w:tblGrid>
+        <w:gridCol w:w="4320"/>
+        <w:gridCol w:w="4320"/>
+      </w:tblGrid>
+      <w:tr>
+        <w:tc>
+          <w:tcPr>
+            <w:tcW w:type="dxa" w:w="4320"/>
+          </w:tcPr>
+          <w:p>
+            <w:r>
+              <w:rPr>
+                <w:b/>
+              </w:rPr>
+              <w:t>Narzędzie</w:t>
+            </w:r>
+          </w:p>
+        </w:tc>
+        <w:tc>
+          <w:tcPr>
+            <w:tcW w:type="dxa" w:w="4320"/>
+          </w:tcPr>
+          <w:p>
+            <w:r>
+              <w:rPr>
+                <w:b/>
+              </w:rPr>
+              <w:t>Do czego</w:t>
+            </w:r>
+          </w:p>
+        </w:tc>
+      </w:tr>
+      <w:tr>
+        <w:tc>
+          <w:tcPr>
+            <w:tcW w:type="dxa" w:w="4320"/>
+          </w:tcPr>
+          <w:p>
+            <w:r>
+              <w:rPr>
+                <w:rFonts w:ascii="Consolas" w:hAnsi="Consolas"/>
+                <w:color w:val="B03060"/>
+                <w:sz w:val="19"/>
+              </w:rPr>
+              <w:t>python tools/e2e_g2.py</w:t>
+            </w:r>
+          </w:p>
+        </w:tc>
+        <w:tc>
+          <w:tcPr>
+            <w:tcW w:type="dxa" w:w="4320"/>
+          </w:tcPr>
+          <w:p>
+            <w:r>
+              <w:rPr/>
+              <w:t xml:space="preserve">pełny test E2E na żywo G2 ↔ supervisor: 47 kroków (core, czas, discovery, sterowanie, dane, alarmy zalanie/dym, anomalie, clear, bulk, parametry, stagnacja, tryb, kalendarz). </w:t>
+            </w:r>
+            <w:r>
+              <w:rPr>
+                <w:rFonts w:ascii="Consolas" w:hAnsi="Consolas"/>
+                <w:color w:val="B03060"/>
+                <w:sz w:val="19"/>
+              </w:rPr>
+              <w:t>--list</w:t>
+            </w:r>
+            <w:r>
+              <w:rPr/>
+              <w:t xml:space="preserve">, </w:t>
+            </w:r>
+            <w:r>
+              <w:rPr>
+                <w:rFonts w:ascii="Consolas" w:hAnsi="Consolas"/>
+                <w:color w:val="B03060"/>
+                <w:sz w:val="19"/>
+              </w:rPr>
+              <w:t>--only grupa</w:t>
+            </w:r>
+            <w:r>
+              <w:rPr/>
+              <w:t xml:space="preserve">, </w:t>
+            </w:r>
+            <w:r>
+              <w:rPr>
+                <w:rFonts w:ascii="Consolas" w:hAnsi="Consolas"/>
+                <w:color w:val="B03060"/>
+                <w:sz w:val="19"/>
+              </w:rPr>
+              <w:t>--skip</w:t>
+            </w:r>
+            <w:r>
+              <w:rPr/>
+              <w:t xml:space="preserve">, </w:t>
+            </w:r>
+            <w:r>
+              <w:rPr>
+                <w:rFonts w:ascii="Consolas" w:hAnsi="Consolas"/>
+                <w:color w:val="B03060"/>
+                <w:sz w:val="19"/>
+              </w:rPr>
+              <w:t>--gap</w:t>
+            </w:r>
+            <w:r>
+              <w:rPr/>
+              <w:t>. Po sobie przywraca parametry/tryb/anomalie.</w:t>
+            </w:r>
+          </w:p>
+        </w:tc>
+      </w:tr>
+      <w:tr>
+        <w:tc>
+          <w:tcPr>
+            <w:tcW w:type="dxa" w:w="4320"/>
+          </w:tcPr>
+          <w:p>
+            <w:r>
+              <w:rPr>
+                <w:rFonts w:ascii="Consolas" w:hAnsi="Consolas"/>
+                <w:color w:val="B03060"/>
+                <w:sz w:val="19"/>
+              </w:rPr>
+              <w:t>python tools/dash_audit.py 100.79.111.24 100.98.155.78</w:t>
+            </w:r>
+          </w:p>
+        </w:tc>
+        <w:tc>
+          <w:tcPr>
+            <w:tcW w:type="dxa" w:w="4320"/>
+          </w:tcPr>
+          <w:p>
+            <w:r>
+              <w:rPr/>
+              <w:t xml:space="preserve">każda encja z dashboardów musi istnieć i nie być </w:t>
+            </w:r>
+            <w:r>
+              <w:rPr>
+                <w:rFonts w:ascii="Consolas" w:hAnsi="Consolas"/>
+                <w:color w:val="B03060"/>
+                <w:sz w:val="19"/>
+              </w:rPr>
+              <w:t>unavailable</w:t>
+            </w:r>
+            <w:r>
+              <w:rPr/>
+              <w:t xml:space="preserve"> (tylko odczyt). „Brakujące” na G2 w </w:t>
+            </w:r>
+            <w:r>
+              <w:rPr>
+                <w:rFonts w:ascii="Consolas" w:hAnsi="Consolas"/>
+                <w:color w:val="B03060"/>
+                <w:sz w:val="19"/>
+              </w:rPr>
+              <w:t>scada-ctl</w:t>
+            </w:r>
+            <w:r>
+              <w:rPr/>
+              <w:t>/</w:t>
+            </w:r>
+            <w:r>
+              <w:rPr>
+                <w:rFonts w:ascii="Consolas" w:hAnsi="Consolas"/>
+                <w:color w:val="B03060"/>
+                <w:sz w:val="19"/>
+              </w:rPr>
+              <w:t>scada-meas</w:t>
+            </w:r>
+            <w:r>
+              <w:rPr/>
+              <w:t xml:space="preserve"> to sondy szablonu — karty renderują się poprawnie.</w:t>
+            </w:r>
+          </w:p>
+        </w:tc>
+      </w:tr>
+      <w:tr>
+        <w:tc>
+          <w:tcPr>
+            <w:tcW w:type="dxa" w:w="4320"/>
+          </w:tcPr>
+          <w:p>
+            <w:r>
+              <w:rPr>
+                <w:rFonts w:ascii="Consolas" w:hAnsi="Consolas"/>
+                <w:color w:val="B03060"/>
+                <w:sz w:val="19"/>
+              </w:rPr>
+              <w:t>python tools/bench_g2.py</w:t>
+            </w:r>
+          </w:p>
+        </w:tc>
+        <w:tc>
+          <w:tcPr>
+            <w:tcW w:type="dxa" w:w="4320"/>
+          </w:tcPr>
+          <w:p>
+            <w:r>
+              <w:rPr/>
+              <w:t xml:space="preserve">benchmark opóźnień G2 ↔ supervisor + kontrola slotów; wyniki w </w:t>
+            </w:r>
+            <w:r>
+              <w:rPr>
+                <w:rFonts w:ascii="Consolas" w:hAnsi="Consolas"/>
+                <w:color w:val="B03060"/>
+                <w:sz w:val="19"/>
+              </w:rPr>
+              <w:t>logs/bench_*.out</w:t>
+            </w:r>
+          </w:p>
+        </w:tc>
+      </w:tr>
+      <w:tr>
+        <w:tc>
+          <w:tcPr>
+            <w:tcW w:type="dxa" w:w="4320"/>
+          </w:tcPr>
+          <w:p>
+            <w:r>
+              <w:rPr>
+                <w:rFonts w:ascii="Consolas" w:hAnsi="Consolas"/>
+                <w:color w:val="B03060"/>
+                <w:sz w:val="19"/>
+              </w:rPr>
+              <w:t>tools/frame_stats.py</w:t>
+            </w:r>
+            <w:r>
+              <w:rPr/>
+              <w:t xml:space="preserve">, </w:t>
+            </w:r>
+            <w:r>
+              <w:rPr>
+                <w:rFonts w:ascii="Consolas" w:hAnsi="Consolas"/>
+                <w:color w:val="B03060"/>
+                <w:sz w:val="19"/>
+              </w:rPr>
+              <w:t>tools/lora_traffic_log.py</w:t>
+            </w:r>
+          </w:p>
+        </w:tc>
+        <w:tc>
+          <w:tcPr>
+            <w:tcW w:type="dxa" w:w="4320"/>
+          </w:tcPr>
+          <w:p>
+            <w:r>
+              <w:rPr/>
+              <w:t xml:space="preserve">rozmiary ramek / analiza ruchu z plików </w:t>
+            </w:r>
+            <w:r>
+              <w:rPr>
+                <w:rFonts w:ascii="Consolas" w:hAnsi="Consolas"/>
+                <w:color w:val="B03060"/>
+                <w:sz w:val="19"/>
+              </w:rPr>
+              <w:t>traffic_*.tsv</w:t>
+            </w:r>
+          </w:p>
+        </w:tc>
+      </w:tr>
+    </w:tbl>
+    <w:p>
+      <w:pPr/>
+    </w:p>
+    <w:p>
+      <w:pPr/>
+      <w:r>
+        <w:rPr/>
+        <w:t>E2E i benchmarku nie uruchamia się na G1 (produkcja).</w:t>
+      </w:r>
+    </w:p>
+    <w:p>
+      <w:pPr>
+        <w:pStyle w:val="Heading2"/>
+      </w:pPr>
+      <w:r>
+        <w:rPr/>
+        <w:t>12. Wyniki benchmarku (G2 ↔ supervisor, mediana z 3 powtórzeń)</w:t>
+      </w:r>
+    </w:p>
+    <w:tbl>
+      <w:tblPr>
+        <w:tblStyle w:val="LightGrid-Accent1"/>
+        <w:tblW w:type="auto" w:w="0"/>
+        <w:tblLook w:firstColumn="1" w:firstRow="1" w:lastColumn="0" w:lastRow="0" w:noHBand="0" w:noVBand="1" w:val="04A0"/>
+      </w:tblPr>
+      <w:tblGrid>
+        <w:gridCol w:w="2160"/>
+        <w:gridCol w:w="2160"/>
+        <w:gridCol w:w="2160"/>
+        <w:gridCol w:w="2160"/>
+      </w:tblGrid>
+      <w:tr>
+        <w:tc>
+          <w:tcPr>
+            <w:tcW w:type="dxa" w:w="2160"/>
+          </w:tcPr>
+          <w:p>
+            <w:r>
+              <w:rPr>
+                <w:b/>
+              </w:rPr>
+              <w:t>Pomiar</w:t>
+            </w:r>
+          </w:p>
+        </w:tc>
+        <w:tc>
+          <w:tcPr>
+            <w:tcW w:type="dxa" w:w="2160"/>
+          </w:tcPr>
+          <w:p>
+            <w:r>
+              <w:rPr>
+                <w:b/>
+              </w:rPr>
+              <w:t>2f126bf (stara)</w:t>
+            </w:r>
+          </w:p>
+        </w:tc>
+        <w:tc>
+          <w:tcPr>
+            <w:tcW w:type="dxa" w:w="2160"/>
+          </w:tcPr>
+          <w:p>
+            <w:r>
+              <w:rPr>
+                <w:b/>
+              </w:rPr>
+              <w:t>v12.6</w:t>
+            </w:r>
+          </w:p>
+        </w:tc>
+        <w:tc>
+          <w:tcPr>
+            <w:tcW w:type="dxa" w:w="2160"/>
+          </w:tcPr>
+          <w:p>
+            <w:r>
+              <w:rPr>
+                <w:b/>
+              </w:rPr>
+              <w:t>v12.10 (końcowa)</w:t>
+            </w:r>
+          </w:p>
+        </w:tc>
+      </w:tr>
+      <w:tr>
+        <w:tc>
+          <w:tcPr>
+            <w:tcW w:type="dxa" w:w="2160"/>
+          </w:tcPr>
+          <w:p>
+            <w:r>
+              <w:rPr/>
+              <w:t>ping</w:t>
+            </w:r>
+          </w:p>
+        </w:tc>
+        <w:tc>
+          <w:tcPr>
+            <w:tcW w:type="dxa" w:w="2160"/>
+          </w:tcPr>
+          <w:p>
+            <w:r>
+              <w:rPr/>
+              <w:t>6 s</w:t>
+            </w:r>
+          </w:p>
+        </w:tc>
+        <w:tc>
+          <w:tcPr>
+            <w:tcW w:type="dxa" w:w="2160"/>
+          </w:tcPr>
+          <w:p>
+            <w:r>
+              <w:rPr/>
+              <w:t>8,6 s</w:t>
+            </w:r>
+          </w:p>
+        </w:tc>
+        <w:tc>
+          <w:tcPr>
+            <w:tcW w:type="dxa" w:w="2160"/>
+          </w:tcPr>
+          <w:p>
+            <w:r>
+              <w:rPr>
+                <w:b/>
+              </w:rPr>
+              <w:t>9,1 s</w:t>
+            </w:r>
+          </w:p>
+        </w:tc>
+      </w:tr>
+      <w:tr>
+        <w:tc>
+          <w:tcPr>
+            <w:tcW w:type="dxa" w:w="2160"/>
+          </w:tcPr>
+          <w:p>
+            <w:r>
+              <w:rPr/>
+              <w:t>sterowanie</w:t>
+            </w:r>
+          </w:p>
+        </w:tc>
+        <w:tc>
+          <w:tcPr>
+            <w:tcW w:type="dxa" w:w="2160"/>
+          </w:tcPr>
+          <w:p>
+            <w:r>
+              <w:rPr/>
+              <w:t>31 s</w:t>
+            </w:r>
+          </w:p>
+        </w:tc>
+        <w:tc>
+          <w:tcPr>
+            <w:tcW w:type="dxa" w:w="2160"/>
+          </w:tcPr>
+          <w:p>
+            <w:r>
+              <w:rPr/>
+              <w:t>26,0 s</w:t>
+            </w:r>
+          </w:p>
+        </w:tc>
+        <w:tc>
+          <w:tcPr>
+            <w:tcW w:type="dxa" w:w="2160"/>
+          </w:tcPr>
+          <w:p>
+            <w:r>
+              <w:rPr>
+                <w:b/>
+              </w:rPr>
+              <w:t>9,2 s</w:t>
+            </w:r>
+          </w:p>
+        </w:tc>
+      </w:tr>
+      <w:tr>
+        <w:tc>
+          <w:tcPr>
+            <w:tcW w:type="dxa" w:w="2160"/>
+          </w:tcPr>
+          <w:p>
+            <w:r>
+              <w:rPr/>
+              <w:t>parametry</w:t>
+            </w:r>
+          </w:p>
+        </w:tc>
+        <w:tc>
+          <w:tcPr>
+            <w:tcW w:type="dxa" w:w="2160"/>
+          </w:tcPr>
+          <w:p>
+            <w:r>
+              <w:rPr/>
+              <w:t>7 s</w:t>
+            </w:r>
+          </w:p>
+        </w:tc>
+        <w:tc>
+          <w:tcPr>
+            <w:tcW w:type="dxa" w:w="2160"/>
+          </w:tcPr>
+          <w:p>
+            <w:r>
+              <w:rPr/>
+              <w:t>11,5 s</w:t>
+            </w:r>
+          </w:p>
+        </w:tc>
+        <w:tc>
+          <w:tcPr>
+            <w:tcW w:type="dxa" w:w="2160"/>
+          </w:tcPr>
+          <w:p>
+            <w:r>
+              <w:rPr>
+                <w:b/>
+              </w:rPr>
+              <w:t>16,8 s</w:t>
+            </w:r>
+          </w:p>
+        </w:tc>
+      </w:tr>
+      <w:tr>
+        <w:tc>
+          <w:tcPr>
+            <w:tcW w:type="dxa" w:w="2160"/>
+          </w:tcPr>
+          <w:p>
+            <w:r>
+              <w:rPr/>
+              <w:t>anomalia (offline→</w:t>
+            </w:r>
+            <w:r>
+              <w:rPr>
+                <w:rFonts w:ascii="Consolas" w:hAnsi="Consolas"/>
+                <w:color w:val="B03060"/>
+                <w:sz w:val="19"/>
+              </w:rPr>
+              <w:t>do</w:t>
+            </w:r>
+            <w:r>
+              <w:rPr/>
+              <w:t>, online→</w:t>
+            </w:r>
+            <w:r>
+              <w:rPr>
+                <w:rFonts w:ascii="Consolas" w:hAnsi="Consolas"/>
+                <w:color w:val="B03060"/>
+                <w:sz w:val="19"/>
+              </w:rPr>
+              <w:t>dn</w:t>
+            </w:r>
+            <w:r>
+              <w:rPr/>
+              <w:t>)</w:t>
+            </w:r>
+          </w:p>
+        </w:tc>
+        <w:tc>
+          <w:tcPr>
+            <w:tcW w:type="dxa" w:w="2160"/>
+          </w:tcPr>
+          <w:p>
+            <w:r>
+              <w:rPr/>
+              <w:t>11 s</w:t>
+            </w:r>
+          </w:p>
+        </w:tc>
+        <w:tc>
+          <w:tcPr>
+            <w:tcW w:type="dxa" w:w="2160"/>
+          </w:tcPr>
+          <w:p>
+            <w:r>
+              <w:rPr/>
+              <w:t>44,9 s</w:t>
+            </w:r>
+          </w:p>
+        </w:tc>
+        <w:tc>
+          <w:tcPr>
+            <w:tcW w:type="dxa" w:w="2160"/>
+          </w:tcPr>
+          <w:p>
+            <w:r>
+              <w:rPr>
+                <w:b/>
+              </w:rPr>
+              <w:t>14,1 s</w:t>
+            </w:r>
+          </w:p>
+        </w:tc>
+      </w:tr>
+      <w:tr>
+        <w:tc>
+          <w:tcPr>
+            <w:tcW w:type="dxa" w:w="2160"/>
+          </w:tcPr>
+          <w:p>
+            <w:r>
+              <w:rPr/>
+              <w:t>zgubione</w:t>
+            </w:r>
+          </w:p>
+        </w:tc>
+        <w:tc>
+          <w:tcPr>
+            <w:tcW w:type="dxa" w:w="2160"/>
+          </w:tcPr>
+          <w:p>
+            <w:r>
+              <w:rPr/>
+              <w:t>—</w:t>
+            </w:r>
+          </w:p>
+        </w:tc>
+        <w:tc>
+          <w:tcPr>
+            <w:tcW w:type="dxa" w:w="2160"/>
+          </w:tcPr>
+          <w:p>
+            <w:r>
+              <w:rPr/>
+              <w:t>—</w:t>
+            </w:r>
+          </w:p>
+        </w:tc>
+        <w:tc>
+          <w:tcPr>
+            <w:tcW w:type="dxa" w:w="2160"/>
+          </w:tcPr>
+          <w:p>
+            <w:r>
+              <w:rPr>
+                <w:b/>
+              </w:rPr>
+              <w:t>0</w:t>
+            </w:r>
+          </w:p>
+        </w:tc>
+      </w:tr>
+      <w:tr>
+        <w:tc>
+          <w:tcPr>
+            <w:tcW w:type="dxa" w:w="2160"/>
+          </w:tcPr>
+          <w:p>
+            <w:r>
+              <w:rPr/>
+              <w:t>sloty (bulk poza oknem)</w:t>
+            </w:r>
+          </w:p>
+        </w:tc>
+        <w:tc>
+          <w:tcPr>
+            <w:tcW w:type="dxa" w:w="2160"/>
+          </w:tcPr>
+          <w:p>
+            <w:r>
+              <w:rPr/>
+              <w:t>—</w:t>
+            </w:r>
+          </w:p>
+        </w:tc>
+        <w:tc>
+          <w:tcPr>
+            <w:tcW w:type="dxa" w:w="2160"/>
+          </w:tcPr>
+          <w:p>
+            <w:r>
+              <w:rPr/>
+              <w:t>PASS</w:t>
+            </w:r>
+          </w:p>
+        </w:tc>
+        <w:tc>
+          <w:tcPr>
+            <w:tcW w:type="dxa" w:w="2160"/>
+          </w:tcPr>
+          <w:p>
+            <w:r>
+              <w:rPr>
+                <w:b/>
+              </w:rPr>
+              <w:t>PASS (0 z 2144 ramek)</w:t>
+            </w:r>
+          </w:p>
+        </w:tc>
+      </w:tr>
+    </w:tbl>
+    <w:p>
+      <w:pPr/>
+    </w:p>
+    <w:p>
+      <w:pPr/>
+      <w:r>
+        <w:rPr/>
+        <w:t xml:space="preserve">Źródło: </w:t>
+      </w:r>
+      <w:r>
+        <w:rPr>
+          <w:rFonts w:ascii="Consolas" w:hAnsi="Consolas"/>
+          <w:color w:val="B03060"/>
+          <w:sz w:val="19"/>
+        </w:rPr>
+        <w:t>logs/bench_v126_20261014.out</w:t>
+      </w:r>
+      <w:r>
+        <w:rPr/>
+        <w:t xml:space="preserve">, </w:t>
+      </w:r>
+      <w:r>
+        <w:rPr>
+          <w:rFonts w:ascii="Consolas" w:hAnsi="Consolas"/>
+          <w:color w:val="B03060"/>
+          <w:sz w:val="19"/>
+        </w:rPr>
+        <w:t>logs/bench_v1210_20261014.out</w:t>
+      </w:r>
+      <w:r>
+        <w:rPr/>
+        <w:t xml:space="preserve"> (pomiar 10 min po restarcie). Ping/parametry/anomalia są nieco powyżej mediany starej wersji — koszt slotowania i hashy zgodności; sterowanie przyspieszyło ~3×. </w:t>
+      </w:r>
+      <w:r>
+        <w:rPr>
+          <w:b/>
+        </w:rPr>
+        <w:t>v12.11</w:t>
+      </w:r>
+      <w:r>
+        <w:rPr/>
+        <w:t xml:space="preserve"> (koniec podwójnej wysyłki parametrów): 11 naciśnięć = 11 ramek, parametry 8/8 w E2E, bench parametrów 9,2 s, 0/5 zgubionych. E2E na v12.6: 46/47 PASS (stagnacji nie da się wyzwolić na żywo — §13).</w:t>
+      </w:r>
+    </w:p>
+    <w:p>
+      <w:pPr>
+        <w:pStyle w:val="Heading2"/>
+      </w:pPr>
+      <w:r>
+        <w:rPr/>
+        <w:t>13. Znane ograniczenia (świadome)</w:t>
+      </w:r>
+    </w:p>
+    <w:p>
+      <w:pPr>
+        <w:pStyle w:val="ListBullet"/>
+      </w:pPr>
+      <w:r>
+        <w:rPr>
+          <w:b/>
+        </w:rPr>
+        <w:t>Transfery startowe G1 ~15 min po restarcie bramki</w:t>
+      </w:r>
+      <w:r>
+        <w:rPr/>
+        <w:t xml:space="preserve"> (devmap / ansnap / bdata). W tym oknie opóźnienia są wyższe; pomiarów nie robić wcześniej niż 10 min po restarcie. </w:t>
+      </w:r>
+      <w:r>
+        <w:rPr>
+          <w:rFonts w:ascii="Consolas" w:hAnsi="Consolas"/>
+          <w:color w:val="B03060"/>
+          <w:sz w:val="19"/>
+        </w:rPr>
+        <w:t>disc_meta</w:t>
+      </w:r>
+      <w:r>
+        <w:rPr/>
+        <w:t xml:space="preserve"> / </w:t>
+      </w:r>
+      <w:r>
+        <w:rPr>
+          <w:rFonts w:ascii="Consolas" w:hAnsi="Consolas"/>
+          <w:color w:val="B03060"/>
+          <w:sz w:val="19"/>
+        </w:rPr>
+        <w:t>disc_vio</w:t>
+      </w:r>
+      <w:r>
+        <w:rPr/>
+        <w:t xml:space="preserve"> czekają na koniec transferu (projektowo, potrafi 5–14 min).</w:t>
+      </w:r>
+    </w:p>
+    <w:p>
+      <w:pPr>
+        <w:pStyle w:val="ListBullet"/>
+      </w:pPr>
+      <w:r>
+        <w:rPr>
+          <w:b/>
+        </w:rPr>
+        <w:t xml:space="preserve">Stagnację zeruje też z2m </w:t>
+      </w:r>
+      <w:r>
+        <w:rPr>
+          <w:rFonts w:ascii="Consolas" w:hAnsi="Consolas"/>
+          <w:b/>
+          <w:color w:val="B03060"/>
+          <w:sz w:val="19"/>
+        </w:rPr>
+        <w:t>availability: online</w:t>
+      </w:r>
+      <w:r>
+        <w:rPr/>
+        <w:t xml:space="preserve"> — zegar stagnacji zeruje KAŻDA wiadomość urządzenia (</w:t>
+      </w:r>
+      <w:r>
+        <w:rPr>
+          <w:rFonts w:ascii="Consolas" w:hAnsi="Consolas"/>
+          <w:color w:val="B03060"/>
+          <w:sz w:val="19"/>
+        </w:rPr>
+        <w:t>gateway_data.py</w:t>
+      </w:r>
+      <w:r>
+        <w:rPr/>
+        <w:t>). Decyzja 2026-10-14: zostaje tak. Stagnacja jest pokryta testami jednostkowymi, na żywo się jej nie wyzwoli.</w:t>
+      </w:r>
+    </w:p>
+    <w:p>
+      <w:pPr>
+        <w:pStyle w:val="ListBullet"/>
+      </w:pPr>
+      <w:r>
+        <w:rPr/>
+        <w:t xml:space="preserve">G1 w dzień: przekaźniki bez napięcia — po restarcie bramki jeden </w:t>
+      </w:r>
+      <w:r>
+        <w:rPr>
+          <w:rFonts w:ascii="Consolas" w:hAnsi="Consolas"/>
+          <w:color w:val="B03060"/>
+          <w:sz w:val="19"/>
+        </w:rPr>
+        <w:t>dsnap</w:t>
+      </w:r>
+      <w:r>
+        <w:rPr/>
+        <w:t xml:space="preserve"> czyści stare wartości (oczekiwane).</w:t>
+      </w:r>
+    </w:p>
+    <w:p>
+      <w:pPr>
+        <w:pStyle w:val="ListBullet"/>
+      </w:pPr>
+      <w:r>
+        <w:rPr/>
+        <w:t>Pomiar ruchu ramek/h dla v12.10+ niewykonany.</w:t>
+      </w:r>
+    </w:p>
+    <w:p>
+      <w:pPr>
+        <w:pStyle w:val="Heading2"/>
+      </w:pPr>
+      <w:r>
+        <w:rPr/>
+        <w:t>14. Powiadomienia alarmowe — Telegram (WDRAŻANE, jeszcze nie przetestowane)</w:t>
+      </w:r>
+    </w:p>
+    <w:p>
+      <w:pPr>
+        <w:ind w:left="432"/>
+      </w:pPr>
+      <w:r>
+        <w:rPr/>
+        <w:t>Sekcja opisuje projekt wdrażany 2026-10-15. Identyfikatory automatyzacji i workflow uzupełnić po wdrożeniu i teście.</w:t>
+      </w:r>
+    </w:p>
+    <w:p>
+      <w:pPr>
+        <w:pStyle w:val="ListBullet"/>
+      </w:pPr>
+      <w:r>
+        <w:rPr>
+          <w:b/>
+        </w:rPr>
+        <w:t>Kanał:</w:t>
+      </w:r>
+      <w:r>
+        <w:rPr/>
+        <w:t xml:space="preserve"> Home Assistant supervisora wysyła wiadomości przez bota Telegram </w:t>
+      </w:r>
+      <w:r>
+        <w:rPr>
+          <w:b/>
+        </w:rPr>
+        <w:t>@jspos_bot</w:t>
+      </w:r>
+      <w:r>
+        <w:rPr/>
+        <w:t xml:space="preserve"> na czat Jakuba.</w:t>
+      </w:r>
+    </w:p>
+    <w:p>
+      <w:pPr>
+        <w:pStyle w:val="ListBullet"/>
+      </w:pPr>
+      <w:r>
+        <w:rPr>
+          <w:b/>
+        </w:rPr>
+        <w:t>Alarmy z HA supervisora:</w:t>
+      </w:r>
+      <w:r>
+        <w:rPr/>
+        <w:t xml:space="preserve"> zalanie, dym, bramka </w:t>
+      </w:r>
+      <w:r>
+        <w:rPr>
+          <w:b/>
+        </w:rPr>
+        <w:t>G1/G2 offline ≥ 5 min</w:t>
+      </w:r>
+      <w:r>
+        <w:rPr/>
+        <w:t xml:space="preserve"> oraz komunikat powrotu bramki (online).</w:t>
+      </w:r>
+    </w:p>
+    <w:p>
+      <w:pPr>
+        <w:pStyle w:val="ListBullet"/>
+      </w:pPr>
+      <w:r>
+        <w:rPr>
+          <w:b/>
+        </w:rPr>
+        <w:t>Watchdog supervisora:</w:t>
+      </w:r>
+      <w:r>
+        <w:rPr/>
+        <w:t xml:space="preserve"> workflow n8n co 5 min sprawdza, czy supervisor żyje; alarm na Telegram po </w:t>
+      </w:r>
+      <w:r>
+        <w:rPr>
+          <w:b/>
+        </w:rPr>
+        <w:t>2 kolejnych porażkach</w:t>
+      </w:r>
+      <w:r>
+        <w:rPr/>
+        <w:t xml:space="preserve"> (supervisor nie może zgłosić własnej awarii).</w:t>
+      </w:r>
+    </w:p>
+    <w:p>
+      <w:pPr>
+        <w:pStyle w:val="ListBullet"/>
+      </w:pPr>
+      <w:r>
+        <w:rPr>
+          <w:b/>
+        </w:rPr>
+        <w:t>Tylko w HA (bez powiadomień):</w:t>
+      </w:r>
+      <w:r>
+        <w:rPr/>
+        <w:t xml:space="preserve"> temperatura, wilgotność, bateria — widoczne na dashboardzie i listach anomalii.</w:t>
+      </w:r>
+    </w:p>
+    <w:p>
+      <w:pPr>
+        <w:pStyle w:val="ListBullet"/>
+      </w:pPr>
+      <w:r>
+        <w:rPr/>
+        <w:t>Tokeny bota i hasła NIE są częścią dokumentacji — żyją w konfiguracji HA / n8n.</w:t>
       </w:r>
     </w:p>
     <w:sectPr>

</xml_diff>